<commit_message>
Tervezési fázis, a megvalósítandó szoftver követelmény leírása
</commit_message>
<xml_diff>
--- a/Szakdolgozat.docx
+++ b/Szakdolgozat.docx
@@ -328,6 +328,46 @@
     </w:p>
     <w:p>
       <w:r>
+        <w:rPr>
+          <w:noProof/>
+        </w:rPr>
+        <w:drawing>
+          <wp:inline distT="0" distB="0" distL="0" distR="0" wp14:anchorId="5CFC9BDB" wp14:editId="73594EA1">
+            <wp:extent cx="5760720" cy="6362700"/>
+            <wp:effectExtent l="0" t="0" r="0" b="0"/>
+            <wp:docPr id="285423508" name="Kép 1" descr="A képen szöveg, képernyőkép, levél, Betűtípus látható&#10;&#10;Előfordulhat, hogy az AI által létrehozott tartalom helytelen."/>
+            <wp:cNvGraphicFramePr>
+              <a:graphicFrameLocks xmlns:a="http://schemas.openxmlformats.org/drawingml/2006/main" noChangeAspect="1"/>
+            </wp:cNvGraphicFramePr>
+            <a:graphic xmlns:a="http://schemas.openxmlformats.org/drawingml/2006/main">
+              <a:graphicData uri="http://schemas.openxmlformats.org/drawingml/2006/picture">
+                <pic:pic xmlns:pic="http://schemas.openxmlformats.org/drawingml/2006/picture">
+                  <pic:nvPicPr>
+                    <pic:cNvPr id="285423508" name="Kép 1" descr="A képen szöveg, képernyőkép, levél, Betűtípus látható&#10;&#10;Előfordulhat, hogy az AI által létrehozott tartalom helytelen."/>
+                    <pic:cNvPicPr/>
+                  </pic:nvPicPr>
+                  <pic:blipFill>
+                    <a:blip r:embed="rId15"/>
+                    <a:stretch>
+                      <a:fillRect/>
+                    </a:stretch>
+                  </pic:blipFill>
+                  <pic:spPr>
+                    <a:xfrm>
+                      <a:off x="0" y="0"/>
+                      <a:ext cx="5760720" cy="6362700"/>
+                    </a:xfrm>
+                    <a:prstGeom prst="rect">
+                      <a:avLst/>
+                    </a:prstGeom>
+                  </pic:spPr>
+                </pic:pic>
+              </a:graphicData>
+            </a:graphic>
+          </wp:inline>
+        </w:drawing>
+      </w:r>
+      <w:r>
         <w:br w:type="page"/>
       </w:r>
     </w:p>
@@ -902,7 +942,7 @@
     <w:p>
       <w:pPr>
         <w:sectPr>
-          <w:footerReference w:type="default" r:id="rId15"/>
+          <w:footerReference w:type="default" r:id="rId16"/>
           <w:pgSz w:w="11906" w:h="16838"/>
           <w:pgMar w:top="1417" w:right="1417" w:bottom="1417" w:left="1417" w:header="708" w:footer="708" w:gutter="0"/>
           <w:cols w:space="708"/>
@@ -926,312 +966,21 @@
     </w:p>
     <w:p>
       <w:r>
-        <w:t xml:space="preserve">A </w:t>
-      </w:r>
-      <w:r>
-        <w:t xml:space="preserve">lap mérete és a </w:t>
-      </w:r>
-      <w:r>
-        <w:t>margók ebben a sablonban megfelelően vannak beállítva.</w:t>
-      </w:r>
-      <w:r>
-        <w:t xml:space="preserve"> </w:t>
-      </w:r>
-      <w:r>
-        <w:t xml:space="preserve">A betűtípus </w:t>
-      </w:r>
-      <w:r>
-        <w:t xml:space="preserve">adott </w:t>
-      </w:r>
-      <w:r>
-        <w:t xml:space="preserve">(Calibri) </w:t>
-      </w:r>
-      <w:r>
-        <w:t>és a</w:t>
-      </w:r>
-      <w:r>
-        <w:t xml:space="preserve"> 12-es</w:t>
-      </w:r>
-      <w:r>
-        <w:t xml:space="preserve"> betűméret</w:t>
-      </w:r>
-      <w:r>
-        <w:t xml:space="preserve"> is</w:t>
-      </w:r>
-      <w:r>
-        <w:t>.</w:t>
-      </w:r>
-      <w:r>
-        <w:t xml:space="preserve"> Oldalszámozás a tartalomjegyzék után kezdődik és a dokumentum végéig folytatódik.</w:t>
-      </w:r>
-      <w:r>
-        <w:t xml:space="preserve"> A dolgozat fő fejezetcímei adottak és mindig új oldalon kezdődnek.</w:t>
-      </w:r>
-    </w:p>
-    <w:p>
-      <w:pPr>
-        <w:keepNext/>
-        <w:jc w:val="center"/>
-      </w:pPr>
-      <w:r>
-        <w:rPr>
-          <w:noProof/>
-          <w:lang w:eastAsia="hu-HU"/>
-        </w:rPr>
-        <w:drawing>
-          <wp:inline distT="0" distB="0" distL="0" distR="0" wp14:anchorId="5EE57A64" wp14:editId="73DA655E">
-            <wp:extent cx="1905000" cy="3025140"/>
-            <wp:effectExtent l="0" t="0" r="0" b="3810"/>
-            <wp:docPr id="2" name="Kép 2" descr="Könyv: Galaxis útikalauz stopposoknak (Douglas Adams)"/>
-            <wp:cNvGraphicFramePr>
-              <a:graphicFrameLocks xmlns:a="http://schemas.openxmlformats.org/drawingml/2006/main" noChangeAspect="1"/>
-            </wp:cNvGraphicFramePr>
-            <a:graphic xmlns:a="http://schemas.openxmlformats.org/drawingml/2006/main">
-              <a:graphicData uri="http://schemas.openxmlformats.org/drawingml/2006/picture">
-                <pic:pic xmlns:pic="http://schemas.openxmlformats.org/drawingml/2006/picture">
-                  <pic:nvPicPr>
-                    <pic:cNvPr id="0" name="Picture 1" descr="Könyv: Galaxis útikalauz stopposoknak (Douglas Adams)"/>
-                    <pic:cNvPicPr>
-                      <a:picLocks noChangeAspect="1" noChangeArrowheads="1"/>
-                    </pic:cNvPicPr>
-                  </pic:nvPicPr>
-                  <pic:blipFill>
-                    <a:blip r:embed="rId16">
-                      <a:extLst>
-                        <a:ext uri="{28A0092B-C50C-407E-A947-70E740481C1C}">
-                          <a14:useLocalDpi xmlns:a14="http://schemas.microsoft.com/office/drawing/2010/main" val="0"/>
-                        </a:ext>
-                      </a:extLst>
-                    </a:blip>
-                    <a:srcRect/>
-                    <a:stretch>
-                      <a:fillRect/>
-                    </a:stretch>
-                  </pic:blipFill>
-                  <pic:spPr bwMode="auto">
-                    <a:xfrm>
-                      <a:off x="0" y="0"/>
-                      <a:ext cx="1905000" cy="3025140"/>
-                    </a:xfrm>
-                    <a:prstGeom prst="rect">
-                      <a:avLst/>
-                    </a:prstGeom>
-                    <a:noFill/>
-                    <a:ln>
-                      <a:noFill/>
-                    </a:ln>
-                  </pic:spPr>
-                </pic:pic>
-              </a:graphicData>
-            </a:graphic>
-          </wp:inline>
-        </w:drawing>
-      </w:r>
-    </w:p>
-    <w:bookmarkStart w:id="4" w:name="_Ref116400530"/>
-    <w:p>
-      <w:pPr>
-        <w:pStyle w:val="Kpalrs"/>
-      </w:pPr>
-      <w:r>
-        <w:fldChar w:fldCharType="begin"/>
-      </w:r>
-      <w:r>
-        <w:instrText xml:space="preserve"> SEQ ábra \* ARABIC </w:instrText>
-      </w:r>
-      <w:r>
-        <w:fldChar w:fldCharType="separate"/>
-      </w:r>
-      <w:r>
-        <w:rPr>
-          <w:noProof/>
-        </w:rPr>
-        <w:t>1</w:t>
-      </w:r>
-      <w:r>
-        <w:fldChar w:fldCharType="end"/>
-      </w:r>
-      <w:r>
-        <w:t>. ábra</w:t>
-      </w:r>
-      <w:bookmarkEnd w:id="4"/>
-      <w:r>
-        <w:t xml:space="preserve">: </w:t>
-      </w:r>
-      <w:r>
-        <w:t>Galaxis útikalauz stopposoknak könyv</w:t>
-      </w:r>
-    </w:p>
-    <w:p>
-      <w:r>
-        <w:t>Használjátok az automatikus számozást az ábrákhoz.</w:t>
-      </w:r>
-      <w:r>
-        <w:t xml:space="preserve"> Túl sok ábra esetén érdemes ábrajegyzéket beszúrni a dokumentum</w:t>
-      </w:r>
-      <w:r>
-        <w:t>ban az Irodalomjegyzék után.</w:t>
-      </w:r>
-      <w:r>
-        <w:t xml:space="preserve"> A folyó szövegben hivatkozzatok minden egyes ábrára és táblázatra is kereszthivatkozással (</w:t>
-      </w:r>
-      <w:r>
-        <w:t xml:space="preserve">például így: </w:t>
-      </w:r>
-      <w:r>
-        <w:fldChar w:fldCharType="begin"/>
-      </w:r>
-      <w:r>
-        <w:instrText xml:space="preserve"> REF _Ref116400530 \h </w:instrText>
-      </w:r>
-      <w:r>
-        <w:fldChar w:fldCharType="separate"/>
-      </w:r>
-      <w:r>
-        <w:rPr>
-          <w:noProof/>
-        </w:rPr>
-        <w:t>1</w:t>
-      </w:r>
-      <w:r>
-        <w:t>. ábra</w:t>
-      </w:r>
-      <w:r>
-        <w:fldChar w:fldCharType="end"/>
-      </w:r>
-      <w:r>
-        <w:t xml:space="preserve">, vagy táblázat esetén így: </w:t>
-      </w:r>
-      <w:r>
-        <w:fldChar w:fldCharType="begin"/>
-      </w:r>
-      <w:r>
-        <w:instrText xml:space="preserve"> REF _Ref116400549 \h </w:instrText>
-      </w:r>
-      <w:r>
-        <w:instrText xml:space="preserve"> \* MERGEFORMAT </w:instrText>
-      </w:r>
-      <w:r>
-        <w:fldChar w:fldCharType="separate"/>
-      </w:r>
-      <w:r>
-        <w:rPr>
-          <w:noProof/>
-        </w:rPr>
-        <w:t>1</w:t>
-      </w:r>
-      <w:r>
-        <w:t>. táblázat</w:t>
-      </w:r>
-      <w:r>
-        <w:fldChar w:fldCharType="end"/>
-      </w:r>
-      <w:r>
-        <w:t>).</w:t>
-      </w:r>
-    </w:p>
-    <w:bookmarkStart w:id="5" w:name="_Ref116400549"/>
-    <w:p>
-      <w:pPr>
-        <w:pStyle w:val="Kpalrs"/>
-        <w:keepNext/>
-      </w:pPr>
-      <w:r>
-        <w:fldChar w:fldCharType="begin"/>
-      </w:r>
-      <w:r>
-        <w:instrText xml:space="preserve"> SEQ táblázat \* ARABIC </w:instrText>
-      </w:r>
-      <w:r>
-        <w:fldChar w:fldCharType="separate"/>
-      </w:r>
-      <w:r>
-        <w:rPr>
-          <w:noProof/>
-        </w:rPr>
-        <w:t>1</w:t>
-      </w:r>
-      <w:r>
-        <w:fldChar w:fldCharType="end"/>
-      </w:r>
-      <w:r>
-        <w:t>. táblázat</w:t>
-      </w:r>
-      <w:bookmarkEnd w:id="5"/>
-      <w:r>
-        <w:t>:</w:t>
-      </w:r>
-      <w:r>
-        <w:t xml:space="preserve"> Példatáblázat</w:t>
-      </w:r>
-    </w:p>
-    <w:tbl>
-      <w:tblPr>
-        <w:tblStyle w:val="Rcsostblzat"/>
-        <w:tblW w:w="0" w:type="auto"/>
-        <w:jc w:val="center"/>
-        <w:tblLook w:val="04A0" w:firstRow="1" w:lastRow="0" w:firstColumn="1" w:lastColumn="0" w:noHBand="0" w:noVBand="1"/>
-      </w:tblPr>
-      <w:tblGrid>
-        <w:gridCol w:w="2831"/>
-        <w:gridCol w:w="2831"/>
-        <w:gridCol w:w="2831"/>
-      </w:tblGrid>
-      <w:tr>
-        <w:trPr>
-          <w:jc w:val="center"/>
-        </w:trPr>
-        <w:tc>
-          <w:tcPr>
-            <w:tcW w:w="2831" w:type="dxa"/>
-          </w:tcPr>
-          <w:p>
-            <w:r>
-              <w:t>asdf</w:t>
-            </w:r>
-          </w:p>
-        </w:tc>
-        <w:tc>
-          <w:tcPr>
-            <w:tcW w:w="2831" w:type="dxa"/>
-          </w:tcPr>
-          <w:p/>
-        </w:tc>
-        <w:tc>
-          <w:tcPr>
-            <w:tcW w:w="2831" w:type="dxa"/>
-          </w:tcPr>
-          <w:p/>
-        </w:tc>
-      </w:tr>
-      <w:tr>
-        <w:trPr>
-          <w:jc w:val="center"/>
-        </w:trPr>
-        <w:tc>
-          <w:tcPr>
-            <w:tcW w:w="2831" w:type="dxa"/>
-          </w:tcPr>
-          <w:p>
-            <w:r>
-              <w:t>1234</w:t>
-            </w:r>
-          </w:p>
-        </w:tc>
-        <w:tc>
-          <w:tcPr>
-            <w:tcW w:w="2831" w:type="dxa"/>
-          </w:tcPr>
-          <w:p/>
-        </w:tc>
-        <w:tc>
-          <w:tcPr>
-            <w:tcW w:w="2831" w:type="dxa"/>
-          </w:tcPr>
-          <w:p/>
-        </w:tc>
-      </w:tr>
-    </w:tbl>
+        <w:t>Ez a dokumentum a PuzzlePlatformer nevű programhoz készült dokumentáció és szakdolgozat.</w:t>
+      </w:r>
+      <w:r>
+        <w:t xml:space="preserve"> A program </w:t>
+      </w:r>
+      <w:r>
+        <w:t>U</w:t>
+      </w:r>
+      <w:r>
+        <w:t>nityvel készül és egy 2D-s játék lesz.</w:t>
+      </w:r>
+      <w:r>
+        <w:t xml:space="preserve"> Menürendszerrel navigálható, pálya kiválasztása után egy oldalnézetes 2D-s felületté válik.</w:t>
+      </w:r>
+    </w:p>
     <w:p/>
     <w:p>
       <w:r>
@@ -1241,15 +990,65 @@
     <w:p>
       <w:pPr>
         <w:pStyle w:val="Cmsor1"/>
-      </w:pPr>
-      <w:bookmarkStart w:id="6" w:name="_Toc87521354"/>
+        <w:spacing w:before="24000"/>
+        <w:ind w:left="431" w:hanging="431"/>
+      </w:pPr>
+      <w:bookmarkStart w:id="4" w:name="_Toc87521354"/>
       <w:r>
         <w:lastRenderedPageBreak/>
         <w:t>Felhasználói dokumentáció</w:t>
       </w:r>
-      <w:bookmarkEnd w:id="6"/>
-    </w:p>
-    <w:p/>
+      <w:bookmarkEnd w:id="4"/>
+    </w:p>
+    <w:p>
+      <w:r>
+        <w:t>A PuzzlePlatformer játék egy Unityben készült alkalmazás. A programban egy menürendszer köszönt elindítás után, ahol beállításokat lehet módosítani</w:t>
+      </w:r>
+      <w:r>
+        <w:t>, bezárni az alkalmazást vagy elindítani a játékot.</w:t>
+      </w:r>
+      <w:r>
+        <w:t xml:space="preserve"> </w:t>
+      </w:r>
+      <w:r>
+        <w:t>A menüben módosítható az ablak típusa, mérete, illetve a hangerő.</w:t>
+      </w:r>
+      <w:r>
+        <w:t xml:space="preserve"> A </w:t>
+      </w:r>
+      <w:r>
+        <w:rPr>
+          <w:i/>
+          <w:iCs/>
+          <w:color w:val="EE0000"/>
+        </w:rPr>
+        <w:t>játékot</w:t>
+      </w:r>
+      <w:r>
+        <w:rPr>
+          <w:color w:val="EE0000"/>
+        </w:rPr>
+        <w:t xml:space="preserve"> </w:t>
+      </w:r>
+      <w:r>
+        <w:t xml:space="preserve">kiválasztva </w:t>
+      </w:r>
+      <w:r>
+        <w:t>kiválasztható egyjátékos vagy többjátékos mód. A többjátékos elkezdéséhez legalább az első 3 pályát teljesíteni kell az egyjátékos módban, hogy legyen kettő karakter</w:t>
+      </w:r>
+      <w:r>
+        <w:t>,</w:t>
+      </w:r>
+      <w:r>
+        <w:t xml:space="preserve"> amivel játszani lehet.</w:t>
+      </w:r>
+      <w:r>
+        <w:t xml:space="preserve"> Elkezdve a játékot először egy térkép látható, amin találhatók a pályákat jelölő gombok. Ezeket sorban kell teljesíteni, egy pályát az előtte lévő teljesítése old fel.</w:t>
+      </w:r>
+      <w:r>
+        <w:t xml:space="preserve"> Minden pálya elején egy rövid történet darab olvasható, ennek megjelenését beállítással módosítani lehet.</w:t>
+      </w:r>
+    </w:p>
     <w:p>
       <w:pPr>
         <w:rPr>
@@ -1266,12 +1065,12 @@
       <w:pPr>
         <w:pStyle w:val="Cmsor1"/>
       </w:pPr>
-      <w:bookmarkStart w:id="7" w:name="_Toc87521355"/>
+      <w:bookmarkStart w:id="5" w:name="_Toc87521355"/>
       <w:r>
         <w:lastRenderedPageBreak/>
         <w:t>Fejlesztői dokumentáció</w:t>
       </w:r>
-      <w:bookmarkEnd w:id="7"/>
+      <w:bookmarkEnd w:id="5"/>
     </w:p>
     <w:p/>
     <w:p>
@@ -1287,8 +1086,8 @@
       <w:pPr>
         <w:pStyle w:val="Cmsor1"/>
       </w:pPr>
-      <w:bookmarkStart w:id="8" w:name="_Toc87521356"/>
-      <w:commentRangeStart w:id="9"/>
+      <w:bookmarkStart w:id="6" w:name="_Toc87521356"/>
+      <w:commentRangeStart w:id="7"/>
       <w:r>
         <w:lastRenderedPageBreak/>
         <w:t>Összefoglalás és tovább</w:t>
@@ -1296,15 +1095,15 @@
       <w:r>
         <w:t>i fejlesztési lehetőségek</w:t>
       </w:r>
-      <w:bookmarkEnd w:id="8"/>
-      <w:commentRangeEnd w:id="9"/>
+      <w:bookmarkEnd w:id="6"/>
+      <w:commentRangeEnd w:id="7"/>
       <w:r>
         <w:rPr>
           <w:rStyle w:val="Jegyzethivatkozs"/>
           <w:sz w:val="32"/>
           <w:szCs w:val="32"/>
         </w:rPr>
-        <w:commentReference w:id="9"/>
+        <w:commentReference w:id="7"/>
       </w:r>
     </w:p>
     <w:p/>
@@ -1317,12 +1116,12 @@
       <w:pPr>
         <w:pStyle w:val="Cmsor1"/>
       </w:pPr>
-      <w:bookmarkStart w:id="10" w:name="_Toc87521357"/>
+      <w:bookmarkStart w:id="8" w:name="_Toc87521357"/>
       <w:r>
         <w:lastRenderedPageBreak/>
         <w:t>Irodalomjegyzék</w:t>
       </w:r>
-      <w:bookmarkEnd w:id="10"/>
+      <w:bookmarkEnd w:id="8"/>
     </w:p>
     <w:p>
       <w:pPr>
@@ -1347,21 +1146,21 @@
       <w:pPr>
         <w:pStyle w:val="Cmsor1"/>
       </w:pPr>
-      <w:bookmarkStart w:id="11" w:name="_Toc87521358"/>
-      <w:commentRangeStart w:id="12"/>
+      <w:bookmarkStart w:id="9" w:name="_Toc87521358"/>
+      <w:commentRangeStart w:id="10"/>
       <w:r>
         <w:lastRenderedPageBreak/>
         <w:t>Melléklet</w:t>
       </w:r>
-      <w:bookmarkEnd w:id="11"/>
-      <w:commentRangeEnd w:id="12"/>
+      <w:bookmarkEnd w:id="9"/>
+      <w:commentRangeEnd w:id="10"/>
       <w:r>
         <w:rPr>
           <w:rStyle w:val="Jegyzethivatkozs"/>
           <w:sz w:val="32"/>
           <w:szCs w:val="32"/>
         </w:rPr>
-        <w:commentReference w:id="12"/>
+        <w:commentReference w:id="10"/>
       </w:r>
     </w:p>
     <w:p>
@@ -1435,7 +1234,7 @@
       </w:r>
     </w:p>
   </w:comment>
-  <w:comment w:id="9" w:author="Németh Gábor Árpád Dr." w:date="2021-11-17T13:25:00Z" w:initials="NGÁD">
+  <w:comment w:id="7" w:author="Németh Gábor Árpád Dr." w:date="2021-11-17T13:25:00Z" w:initials="NGÁD">
     <w:p>
       <w:pPr>
         <w:pStyle w:val="Jegyzetszveg"/>
@@ -1466,7 +1265,7 @@
       </w:r>
     </w:p>
   </w:comment>
-  <w:comment w:id="12" w:author="Gludovátz Attila" w:date="2021-11-11T11:08:00Z" w:initials="GA">
+  <w:comment w:id="10" w:author="Gludovátz Attila" w:date="2021-11-11T11:08:00Z" w:initials="GA">
     <w:p>
       <w:pPr>
         <w:pStyle w:val="Jegyzetszveg"/>
@@ -2629,6 +2428,7 @@
   <w:style w:type="character" w:default="1" w:styleId="Bekezdsalapbettpusa">
     <w:name w:val="Default Paragraph Font"/>
     <w:uiPriority w:val="1"/>
+    <w:semiHidden/>
     <w:unhideWhenUsed/>
   </w:style>
   <w:style w:type="table" w:default="1" w:styleId="Normltblzat">
@@ -3445,10 +3245,6 @@
 </file>
 
 <file path=customXml/item1.xml><?xml version="1.0" encoding="utf-8"?>
-<b:Sources xmlns:b="http://schemas.openxmlformats.org/officeDocument/2006/bibliography" xmlns="http://schemas.openxmlformats.org/officeDocument/2006/bibliography" SelectedStyle="\APASixthEditionOfficeOnline.xsl" StyleName="APA" Version="6"/>
-</file>
-
-<file path=customXml/item2.xml><?xml version="1.0" encoding="utf-8"?>
 <ct:contentTypeSchema xmlns:ct="http://schemas.microsoft.com/office/2006/metadata/contentType" xmlns:ma="http://schemas.microsoft.com/office/2006/metadata/properties/metaAttributes" ct:_="" ma:_="" ma:contentTypeName="Document" ma:contentTypeID="0x01010057D746A6CC7228419059D1F304ECB892" ma:contentTypeVersion="6" ma:contentTypeDescription="Create a new document." ma:contentTypeScope="" ma:versionID="230bd601e8ab138a3182c21189d57f93">
   <xsd:schema xmlns:xsd="http://www.w3.org/2001/XMLSchema" xmlns:xs="http://www.w3.org/2001/XMLSchema" xmlns:p="http://schemas.microsoft.com/office/2006/metadata/properties" xmlns:ns2="23369ae5-05ef-4c7c-a662-deac929baaef" targetNamespace="http://schemas.microsoft.com/office/2006/metadata/properties" ma:root="true" ma:fieldsID="ed8cacf55a6d923cbbf7f604d05b507d" ns2:_="">
     <xsd:import namespace="23369ae5-05ef-4c7c-a662-deac929baaef"/>
@@ -3606,6 +3402,10 @@
 </ct:contentTypeSchema>
 </file>
 
+<file path=customXml/item2.xml><?xml version="1.0" encoding="utf-8"?>
+<b:Sources xmlns:b="http://schemas.openxmlformats.org/officeDocument/2006/bibliography" xmlns="http://schemas.openxmlformats.org/officeDocument/2006/bibliography" SelectedStyle="\APASixthEditionOfficeOnline.xsl" StyleName="APA" Version="6"/>
+</file>
+
 <file path=customXml/item3.xml><?xml version="1.0" encoding="utf-8"?>
 <?mso-contentType ?>
 <FormTemplates xmlns="http://schemas.microsoft.com/sharepoint/v3/contenttype/forms">
@@ -3616,14 +3416,6 @@
 </file>
 
 <file path=customXml/itemProps1.xml><?xml version="1.0" encoding="utf-8"?>
-<ds:datastoreItem xmlns:ds="http://schemas.openxmlformats.org/officeDocument/2006/customXml" ds:itemID="{E9F6CDE2-636C-4043-AFFC-7CB0CE5DF55A}">
-  <ds:schemaRefs>
-    <ds:schemaRef ds:uri="http://schemas.openxmlformats.org/officeDocument/2006/bibliography"/>
-  </ds:schemaRefs>
-</ds:datastoreItem>
-</file>
-
-<file path=customXml/itemProps2.xml><?xml version="1.0" encoding="utf-8"?>
 <ds:datastoreItem xmlns:ds="http://schemas.openxmlformats.org/officeDocument/2006/customXml" ds:itemID="{E0E361D0-270A-43DD-B744-DC4991A38C53}">
   <ds:schemaRefs>
     <ds:schemaRef ds:uri="http://schemas.microsoft.com/office/2006/metadata/contentType"/>
@@ -3641,6 +3433,14 @@
 </ds:datastoreItem>
 </file>
 
+<file path=customXml/itemProps2.xml><?xml version="1.0" encoding="utf-8"?>
+<ds:datastoreItem xmlns:ds="http://schemas.openxmlformats.org/officeDocument/2006/customXml" ds:itemID="{E9F6CDE2-636C-4043-AFFC-7CB0CE5DF55A}">
+  <ds:schemaRefs>
+    <ds:schemaRef ds:uri="http://schemas.openxmlformats.org/officeDocument/2006/bibliography"/>
+  </ds:schemaRefs>
+</ds:datastoreItem>
+</file>
+
 <file path=customXml/itemProps3.xml><?xml version="1.0" encoding="utf-8"?>
 <ds:datastoreItem xmlns:ds="http://schemas.openxmlformats.org/officeDocument/2006/customXml" ds:itemID="{79D0F40F-646A-4DBF-9119-0FC598DFBBBB}">
   <ds:schemaRefs>

</xml_diff>

<commit_message>
1. Mérföldkő Tervezési fázis, a megvalósítandó szoftver követelmény leírása
</commit_message>
<xml_diff>
--- a/Szakdolgozat.docx
+++ b/Szakdolgozat.docx
@@ -968,17 +968,53 @@
       <w:r>
         <w:t>Ez a dokumentum a PuzzlePlatformer nevű programhoz készült dokumentáció és szakdolgozat.</w:t>
       </w:r>
-      <w:r>
-        <w:t xml:space="preserve"> A program </w:t>
-      </w:r>
-      <w:r>
-        <w:t>U</w:t>
-      </w:r>
-      <w:r>
-        <w:t>nityvel készül és egy 2D-s játék lesz.</w:t>
-      </w:r>
-      <w:r>
-        <w:t xml:space="preserve"> Menürendszerrel navigálható, pálya kiválasztása után egy oldalnézetes 2D-s felületté válik.</w:t>
+    </w:p>
+    <w:p>
+      <w:r>
+        <w:t>A program</w:t>
+      </w:r>
+      <w:r>
+        <w:t xml:space="preserve"> </w:t>
+      </w:r>
+      <w:r>
+        <w:t xml:space="preserve">Unityben készül, ahol lesz menürendszer és 2D-s platformer pályák, amiken különböző rejtvényeket megoldva kell átjutni. A menüben lesz egy kilépés gomb, amivel bezárható a program. </w:t>
+      </w:r>
+      <w:r>
+        <w:t>Lesz egy beállítások gomb, ami felhoz egy másik menüt, ahol állítható a hangerő, az ablakfelbontása és az ablak módja. A Játék gombot megnyomva kiválasztható lesz, hogy egyjátékos vagy többjátékos módban induljon a játék.</w:t>
+      </w:r>
+    </w:p>
+    <w:p>
+      <w:r>
+        <w:t xml:space="preserve"> </w:t>
+      </w:r>
+      <w:r>
+        <w:t xml:space="preserve">A játékmód kiválasztása után </w:t>
+      </w:r>
+      <w:r>
+        <w:t xml:space="preserve">egy térképen lesz kiválasztható melyik pálya induljon el. Először csak az első pálya érhető el. Minden egyes pálya teljesítésével feloldható a következő. </w:t>
+      </w:r>
+      <w:r>
+        <w:t>Némelyik pálya teljesítésével megszerezhető lesz új karakter, első új karakter megszerzése után lehet majd többjátékosban játszani.</w:t>
+      </w:r>
+      <w:r>
+        <w:t xml:space="preserve"> Bizonyos többjátékos pályák feloldásához előbb egyjátékosban fel kell oldani egy karaktert. A pályákon az ajtó elérése a cél. Ehhez </w:t>
+      </w:r>
+      <w:r>
+        <w:t>különböző mechanikákat kell majd használni. Ilyen mechanikák például gombok megnyomása kapuk nyitásához, ugrópad használata magasba jutáshoz. Eközben fontos elkerülni a veszélyes elemit a pályának.</w:t>
+      </w:r>
+      <w:r>
+        <w:t xml:space="preserve"> A térképen, illetve pályák közben lesz megállító menü, ahol a beállítások módosíthatók, egy új opcióval kibővítve. A pályákra belépve feljön egy rövid történtrészlet, ennek a panelnek a megjelenését lehet állítani, hogy mindig, </w:t>
+      </w:r>
+      <w:r>
+        <w:t>soha,</w:t>
+      </w:r>
+      <w:r>
+        <w:t xml:space="preserve"> vagy csak az első alkalomkor jelenjen meg.</w:t>
+      </w:r>
+    </w:p>
+    <w:p>
+      <w:r>
+        <w:t>A játék célja, hogy teljesítsd az összes pályát, szerezd meg az össze karaktert és élvezd a játékot.</w:t>
       </w:r>
     </w:p>
     <w:p/>
@@ -1011,10 +1047,7 @@
         <w:t xml:space="preserve"> </w:t>
       </w:r>
       <w:r>
-        <w:t>A menüben módosítható az ablak típusa, mérete, illetve a hangerő.</w:t>
-      </w:r>
-      <w:r>
-        <w:t xml:space="preserve"> A </w:t>
+        <w:t xml:space="preserve">A menüben módosítható az ablak típusa, mérete, illetve a hangerő. A </w:t>
       </w:r>
       <w:r>
         <w:rPr>
@@ -3245,6 +3278,10 @@
 </file>
 
 <file path=customXml/item1.xml><?xml version="1.0" encoding="utf-8"?>
+<b:Sources xmlns:b="http://schemas.openxmlformats.org/officeDocument/2006/bibliography" xmlns="http://schemas.openxmlformats.org/officeDocument/2006/bibliography" SelectedStyle="\APASixthEditionOfficeOnline.xsl" StyleName="APA" Version="6"/>
+</file>
+
+<file path=customXml/item2.xml><?xml version="1.0" encoding="utf-8"?>
 <ct:contentTypeSchema xmlns:ct="http://schemas.microsoft.com/office/2006/metadata/contentType" xmlns:ma="http://schemas.microsoft.com/office/2006/metadata/properties/metaAttributes" ct:_="" ma:_="" ma:contentTypeName="Document" ma:contentTypeID="0x01010057D746A6CC7228419059D1F304ECB892" ma:contentTypeVersion="6" ma:contentTypeDescription="Create a new document." ma:contentTypeScope="" ma:versionID="230bd601e8ab138a3182c21189d57f93">
   <xsd:schema xmlns:xsd="http://www.w3.org/2001/XMLSchema" xmlns:xs="http://www.w3.org/2001/XMLSchema" xmlns:p="http://schemas.microsoft.com/office/2006/metadata/properties" xmlns:ns2="23369ae5-05ef-4c7c-a662-deac929baaef" targetNamespace="http://schemas.microsoft.com/office/2006/metadata/properties" ma:root="true" ma:fieldsID="ed8cacf55a6d923cbbf7f604d05b507d" ns2:_="">
     <xsd:import namespace="23369ae5-05ef-4c7c-a662-deac929baaef"/>
@@ -3402,10 +3439,6 @@
 </ct:contentTypeSchema>
 </file>
 
-<file path=customXml/item2.xml><?xml version="1.0" encoding="utf-8"?>
-<b:Sources xmlns:b="http://schemas.openxmlformats.org/officeDocument/2006/bibliography" xmlns="http://schemas.openxmlformats.org/officeDocument/2006/bibliography" SelectedStyle="\APASixthEditionOfficeOnline.xsl" StyleName="APA" Version="6"/>
-</file>
-
 <file path=customXml/item3.xml><?xml version="1.0" encoding="utf-8"?>
 <?mso-contentType ?>
 <FormTemplates xmlns="http://schemas.microsoft.com/sharepoint/v3/contenttype/forms">
@@ -3416,6 +3449,14 @@
 </file>
 
 <file path=customXml/itemProps1.xml><?xml version="1.0" encoding="utf-8"?>
+<ds:datastoreItem xmlns:ds="http://schemas.openxmlformats.org/officeDocument/2006/customXml" ds:itemID="{E9F6CDE2-636C-4043-AFFC-7CB0CE5DF55A}">
+  <ds:schemaRefs>
+    <ds:schemaRef ds:uri="http://schemas.openxmlformats.org/officeDocument/2006/bibliography"/>
+  </ds:schemaRefs>
+</ds:datastoreItem>
+</file>
+
+<file path=customXml/itemProps2.xml><?xml version="1.0" encoding="utf-8"?>
 <ds:datastoreItem xmlns:ds="http://schemas.openxmlformats.org/officeDocument/2006/customXml" ds:itemID="{E0E361D0-270A-43DD-B744-DC4991A38C53}">
   <ds:schemaRefs>
     <ds:schemaRef ds:uri="http://schemas.microsoft.com/office/2006/metadata/contentType"/>
@@ -3433,14 +3474,6 @@
 </ds:datastoreItem>
 </file>
 
-<file path=customXml/itemProps2.xml><?xml version="1.0" encoding="utf-8"?>
-<ds:datastoreItem xmlns:ds="http://schemas.openxmlformats.org/officeDocument/2006/customXml" ds:itemID="{E9F6CDE2-636C-4043-AFFC-7CB0CE5DF55A}">
-  <ds:schemaRefs>
-    <ds:schemaRef ds:uri="http://schemas.openxmlformats.org/officeDocument/2006/bibliography"/>
-  </ds:schemaRefs>
-</ds:datastoreItem>
-</file>
-
 <file path=customXml/itemProps3.xml><?xml version="1.0" encoding="utf-8"?>
 <ds:datastoreItem xmlns:ds="http://schemas.openxmlformats.org/officeDocument/2006/customXml" ds:itemID="{79D0F40F-646A-4DBF-9119-0FC598DFBBBB}">
   <ds:schemaRefs>

</xml_diff>

<commit_message>
2. Mérföldkő A tervezett szoftver architektúrája
</commit_message>
<xml_diff>
--- a/Szakdolgozat.docx
+++ b/Szakdolgozat.docx
@@ -744,7 +744,7 @@
                 <w:noProof/>
                 <w:webHidden/>
               </w:rPr>
-              <w:t>4</w:t>
+              <w:t>5</w:t>
             </w:r>
             <w:r>
               <w:rPr>
@@ -832,7 +832,7 @@
                 <w:noProof/>
                 <w:webHidden/>
               </w:rPr>
-              <w:t>5</w:t>
+              <w:t>6</w:t>
             </w:r>
             <w:r>
               <w:rPr>
@@ -920,7 +920,7 @@
                 <w:noProof/>
                 <w:webHidden/>
               </w:rPr>
-              <w:t>6</w:t>
+              <w:t>7</w:t>
             </w:r>
             <w:r>
               <w:rPr>
@@ -1103,7 +1103,97 @@
       </w:r>
       <w:bookmarkEnd w:id="5"/>
     </w:p>
-    <w:p/>
+    <w:p>
+      <w:r>
+        <w:t xml:space="preserve">A programot elindítva egy menü fogad, ahol módosítani lehet a beállításokat, bezárni a programot, és elindítani a játékot egy bizonyos módban. Kiválasztva az egyjátékos vagy többjátékos módot egy térkép töltődik be, ahol ki lehet választani a teljesíteni kívánt pályát. Első alkalommal sorban az első pályától kezdve lehet indítani. A kiválasztva egyet, egy 2D-s pálya fogad, ahol egy karaktert lehet mozgatni billentyűzet segítségével. Bizonyos pályákon több karakter is használandó. A pályákon lehet csillagokat gyűjteni, és érdemes is mivel szakaszonként bizonyos csillagszámmal oldódik csak fel a következő pálya. </w:t>
+      </w:r>
+      <w:r>
+        <w:t>Minden pályán van egy ajtó, ennek az elérése a cél. A pályákon különböző akadályok is szerepelnek. Vannak tüske elemek, amelyekhez hozzáérve újra kell kezdeni a pályát. Ezek a tüskék lehetnek a földön, falon vagy plafonon is. Találhatók még dobbantók, amelyekre ráugorva magasba repül a karakter. A pályákon található négy különböző színben gombok. Ezeknek két típusa van, az egyik megnyomva marad, ha leszáll róla a karakter. A másik fajta, csak addig aktív amíg valamelyik karakter rajta áll. Ezek a gombok különböző színű kapukat aktiválnak.</w:t>
+      </w:r>
+      <w:r>
+        <w:t xml:space="preserve"> A gombok és dobbantók segítségével kell elkerülni a tüskéket, megszerezni a csillagokat és elérni az ajtót minden karakterrel.</w:t>
+      </w:r>
+      <w:r>
+        <w:t xml:space="preserve"> </w:t>
+      </w:r>
+    </w:p>
+    <w:p>
+      <w:r>
+        <w:t>Unity 2022.3.62f2 verzióban készítettem a programot.</w:t>
+      </w:r>
+      <w:r>
+        <w:t xml:space="preserve"> A program kódja C# nyelven van, és a különböző scriptek a Unity-s object-ekhez vannak rendelve. Unity-ben létrehoztam saját layer-eket, custom típusokat, hogy megvalósítsam a programot. A pályák egy grid-en szereplő több tilemap-ből álló szerkezetben vannak, amelyek 2Ds nézete adja a pálya egészét. Emellett minden pályához tartozik egy háttér is. Mivel a pályákat fájlból tölti be a program, ezért minden pályához tartozik egy json fájl</w:t>
+      </w:r>
+      <w:r>
+        <w:t>,</w:t>
+      </w:r>
+      <w:r>
+        <w:t xml:space="preserve"> ami a</w:t>
+      </w:r>
+      <w:r>
+        <w:t xml:space="preserve"> szükséges adatokat tartalmazz</w:t>
+      </w:r>
+      <w:r>
+        <w:t>a</w:t>
+      </w:r>
+      <w:r>
+        <w:t>.</w:t>
+      </w:r>
+    </w:p>
+    <w:p>
+      <w:r>
+        <w:t>A scriptek azon része, amely</w:t>
+      </w:r>
+      <w:r>
+        <w:t>ek</w:t>
+      </w:r>
+      <w:r>
+        <w:t xml:space="preserve"> egy Unity-s gameobject-hez vannak csatolva, azok MonoBehavio</w:t>
+      </w:r>
+      <w:r>
+        <w:t>u</w:t>
+      </w:r>
+      <w:r>
+        <w:t xml:space="preserve">r osztályból vannak származtatva. Ezek tartalmaznak Awake, Start, Update, és FixedUpdate függvényeket, amelyek Unity-ben előre meghatározott esetekben futnak le. </w:t>
+      </w:r>
+      <w:r>
+        <w:t>Bizonyos scriptek tartalmaznak OnTriggerEnter2D vagy OnTriggerExit2D függvényeket, ezek a pályán a különböző elemek érintésének érzékelésé</w:t>
+      </w:r>
+      <w:r>
+        <w:t xml:space="preserve">ben segítenek, és egyike </w:t>
+      </w:r>
+      <w:r>
+        <w:t>Unity-be beépített függvények</w:t>
+      </w:r>
+      <w:r>
+        <w:t>nek</w:t>
+      </w:r>
+      <w:r>
+        <w:t xml:space="preserve">. </w:t>
+      </w:r>
+      <w:r>
+        <w:t xml:space="preserve">A scriptek között van két fő fájl a „MenuCotroller.cs” és a „Game.cs”. Ezek látják el a fő műveleteket a program során. A MenuController tartalmazza a menüben szereplő gombok funkciójának megvalósítását, a „SceneLoader.cs” segítségével a játékra váltást. </w:t>
+      </w:r>
+      <w:r>
+        <w:lastRenderedPageBreak/>
+        <w:t>Onnantól a Game script folytatja a funkciók végrehajtását.</w:t>
+      </w:r>
+      <w:r>
+        <w:t xml:space="preserve"> A játékmenüben található beállításokat, és a kiválasztott pályának a betöltéséhez szükséges függvényhívásokat tartalmazza.</w:t>
+      </w:r>
+      <w:r>
+        <w:t xml:space="preserve"> </w:t>
+      </w:r>
+      <w:r>
+        <w:t xml:space="preserve">A pályák betöltését valójában hat másik script segíti, rétegenként egy script. A fő réteget, ami az érinthető domborzatot tartalmazza, betöltő script fogja össze a többi ötöt. Ezek a tilemap különböző rétegeit betöltő és funkcióit megvalósító scriptek tartalmaznak egy statikus „instance” változót, aminek segítségével hívódnak meg a betöltéshez szükséges függvények. </w:t>
+      </w:r>
+      <w:r>
+        <w:t xml:space="preserve">A karakterek mozgását a karakterekhez hozzárendelt „PlayerMovement.cs” script tartalmazza, amely figyeli a lenyomott billentyűzeteket és mozgatja az adott karaktert annak megfelelően. </w:t>
+      </w:r>
+      <w:r>
+        <w:t>A Game script tartalmaz hivatkozásokat a létező játékosokhoz, és scriptjeikhez, emellett tárolja a beállításokat, aktuális pálya számát, összegyűjtött csillagok mennyiségét, és egyszerre tartalmazza az egyjátékos és többjátékos mód megvalósítását.</w:t>
+      </w:r>
+    </w:p>
     <w:p>
       <w:pPr>
         <w:spacing w:after="160" w:line="259" w:lineRule="auto"/>
@@ -2459,7 +2549,6 @@
   <w:style w:type="character" w:default="1" w:styleId="Bekezdsalapbettpusa">
     <w:name w:val="Default Paragraph Font"/>
     <w:uiPriority w:val="1"/>
-    <w:semiHidden/>
     <w:unhideWhenUsed/>
   </w:style>
   <w:style w:type="table" w:default="1" w:styleId="Normltblzat">
@@ -3276,15 +3365,6 @@
 </file>
 
 <file path=customXml/item1.xml><?xml version="1.0" encoding="utf-8"?>
-<?mso-contentType ?>
-<FormTemplates xmlns="http://schemas.microsoft.com/sharepoint/v3/contenttype/forms">
-  <Display>DocumentLibraryForm</Display>
-  <Edit>DocumentLibraryForm</Edit>
-  <New>DocumentLibraryForm</New>
-</FormTemplates>
-</file>
-
-<file path=customXml/item2.xml><?xml version="1.0" encoding="utf-8"?>
 <ct:contentTypeSchema xmlns:ct="http://schemas.microsoft.com/office/2006/metadata/contentType" xmlns:ma="http://schemas.microsoft.com/office/2006/metadata/properties/metaAttributes" ct:_="" ma:_="" ma:contentTypeName="Document" ma:contentTypeID="0x01010057D746A6CC7228419059D1F304ECB892" ma:contentTypeVersion="6" ma:contentTypeDescription="Create a new document." ma:contentTypeScope="" ma:versionID="230bd601e8ab138a3182c21189d57f93">
   <xsd:schema xmlns:xsd="http://www.w3.org/2001/XMLSchema" xmlns:xs="http://www.w3.org/2001/XMLSchema" xmlns:p="http://schemas.microsoft.com/office/2006/metadata/properties" xmlns:ns2="23369ae5-05ef-4c7c-a662-deac929baaef" targetNamespace="http://schemas.microsoft.com/office/2006/metadata/properties" ma:root="true" ma:fieldsID="ed8cacf55a6d923cbbf7f604d05b507d" ns2:_="">
     <xsd:import namespace="23369ae5-05ef-4c7c-a662-deac929baaef"/>
@@ -3442,19 +3522,20 @@
 </ct:contentTypeSchema>
 </file>
 
+<file path=customXml/item2.xml><?xml version="1.0" encoding="utf-8"?>
+<?mso-contentType ?>
+<FormTemplates xmlns="http://schemas.microsoft.com/sharepoint/v3/contenttype/forms">
+  <Display>DocumentLibraryForm</Display>
+  <Edit>DocumentLibraryForm</Edit>
+  <New>DocumentLibraryForm</New>
+</FormTemplates>
+</file>
+
 <file path=customXml/item3.xml><?xml version="1.0" encoding="utf-8"?>
 <b:Sources xmlns:b="http://schemas.openxmlformats.org/officeDocument/2006/bibliography" xmlns="http://schemas.openxmlformats.org/officeDocument/2006/bibliography" SelectedStyle="\APASixthEditionOfficeOnline.xsl" StyleName="APA" Version="6"/>
 </file>
 
 <file path=customXml/itemProps1.xml><?xml version="1.0" encoding="utf-8"?>
-<ds:datastoreItem xmlns:ds="http://schemas.openxmlformats.org/officeDocument/2006/customXml" ds:itemID="{79D0F40F-646A-4DBF-9119-0FC598DFBBBB}">
-  <ds:schemaRefs>
-    <ds:schemaRef ds:uri="http://schemas.microsoft.com/sharepoint/v3/contenttype/forms"/>
-  </ds:schemaRefs>
-</ds:datastoreItem>
-</file>
-
-<file path=customXml/itemProps2.xml><?xml version="1.0" encoding="utf-8"?>
 <ds:datastoreItem xmlns:ds="http://schemas.openxmlformats.org/officeDocument/2006/customXml" ds:itemID="{E0E361D0-270A-43DD-B744-DC4991A38C53}">
   <ds:schemaRefs>
     <ds:schemaRef ds:uri="http://schemas.microsoft.com/office/2006/metadata/contentType"/>
@@ -3472,6 +3553,14 @@
 </ds:datastoreItem>
 </file>
 
+<file path=customXml/itemProps2.xml><?xml version="1.0" encoding="utf-8"?>
+<ds:datastoreItem xmlns:ds="http://schemas.openxmlformats.org/officeDocument/2006/customXml" ds:itemID="{79D0F40F-646A-4DBF-9119-0FC598DFBBBB}">
+  <ds:schemaRefs>
+    <ds:schemaRef ds:uri="http://schemas.microsoft.com/sharepoint/v3/contenttype/forms"/>
+  </ds:schemaRefs>
+</ds:datastoreItem>
+</file>
+
 <file path=customXml/itemProps3.xml><?xml version="1.0" encoding="utf-8"?>
 <ds:datastoreItem xmlns:ds="http://schemas.openxmlformats.org/officeDocument/2006/customXml" ds:itemID="{E9F6CDE2-636C-4043-AFFC-7CB0CE5DF55A}">
   <ds:schemaRefs>

</xml_diff>

<commit_message>
Multiplayer maps and complete
</commit_message>
<xml_diff>
--- a/Szakdolgozat.docx
+++ b/Szakdolgozat.docx
@@ -656,7 +656,7 @@
                 <w:noProof/>
                 <w:webHidden/>
               </w:rPr>
-              <w:t>3</w:t>
+              <w:t>4</w:t>
             </w:r>
             <w:r>
               <w:rPr>
@@ -744,7 +744,7 @@
                 <w:noProof/>
                 <w:webHidden/>
               </w:rPr>
-              <w:t>5</w:t>
+              <w:t>6</w:t>
             </w:r>
             <w:r>
               <w:rPr>
@@ -832,7 +832,7 @@
                 <w:noProof/>
                 <w:webHidden/>
               </w:rPr>
-              <w:t>6</w:t>
+              <w:t>7</w:t>
             </w:r>
             <w:r>
               <w:rPr>
@@ -920,7 +920,7 @@
                 <w:noProof/>
                 <w:webHidden/>
               </w:rPr>
-              <w:t>7</w:t>
+              <w:t>8</w:t>
             </w:r>
             <w:r>
               <w:rPr>
@@ -1077,7 +1077,72 @@
         <w:t xml:space="preserve"> Elkezdve a játékot először egy térkép látható, amin találhatók a pályákat jelölő gombok. Ezeket sorban kell teljesíteni, egy pályát az előtte lévő teljesítése old fel.</w:t>
       </w:r>
       <w:r>
-        <w:t xml:space="preserve"> Minden pálya elején egy rövid történet darab olvasható, ennek megjelenését beállítással módosítani lehet.</w:t>
+        <w:t xml:space="preserve"> Néhány</w:t>
+      </w:r>
+      <w:r>
+        <w:t xml:space="preserve"> pálya elején egy rövid történet darab olvasható, ennek megjelenését beállítással módosítani lehet.</w:t>
+      </w:r>
+      <w:r>
+        <w:t xml:space="preserve"> </w:t>
+      </w:r>
+    </w:p>
+    <w:p>
+      <w:r>
+        <w:t xml:space="preserve">A legtöbb osztályt, a MonoBehaviour osztályból származtatva hoztam létre, ezzel a létrehozott osztályok tartalmazzák a szükséges tulajdonságokat, hogy egy unity-s objektumhoz köthetőek legyenek. Ezt kihasználva olyan osztályokat és függvényeket írtam, amelyek akár többször is felhasználhatóak legyenek, különböző objektumokhoz rendelve. Például a PlayerMovement osztály billentyű lenyomására, a hozzárendelt objektum mozgatását teszi lehetővé. </w:t>
+      </w:r>
+    </w:p>
+    <w:p>
+      <w:r>
+        <w:t xml:space="preserve">A program elindítása után, a főmenü nyílik meg ahol három felirat látszik. Ezekre </w:t>
+      </w:r>
+      <w:r>
+        <w:t xml:space="preserve">lehet </w:t>
+      </w:r>
+      <w:r>
+        <w:t>kattintani</w:t>
+      </w:r>
+      <w:r>
+        <w:t xml:space="preserve"> és</w:t>
+      </w:r>
+      <w:r>
+        <w:t xml:space="preserve"> ha csak felé húzzuk a kurzort, jobb oldalt megjelenik egy rövid leírás az opcióval kapcsolatban. A </w:t>
+      </w:r>
+      <w:r>
+        <w:t xml:space="preserve">Játék szövegre kattintva egy kisebb ablak jelenik meg, ahol kiválasztható a játékmód, egy- vagy többjátékos, illetve a </w:t>
+      </w:r>
+      <w:r>
+        <w:t>mégse</w:t>
+      </w:r>
+      <w:r>
+        <w:t xml:space="preserve"> gombbal bezárható ez a kis választó felület. A Beállítások-at kiválasztva is megjelenik egy panel, ahol módosítható a program hangereje, felbontása és ablakmódja. Az utóbbi három opciót, míg a felbontás a használt monitortól függően különböző mennyiségű opciót tartalmazhat. A vissza gombbal bezárva a panelt a Kilépéssel a programot is be lehet zárni.</w:t>
+      </w:r>
+    </w:p>
+    <w:p>
+      <w:r>
+        <w:t xml:space="preserve">A Játék menüt kiválasztva az Egyjátékos gombot megnyomva egy térkép töltődik be. A térképen láthatók a pályák, amelyeket sorrendben lehet megoldani. A pályákon csillagokat kell gyűjteni és elérni az ajtót. A vízszintes mozgás az A és D gombokkal történik, az ugrás pedig a W-vel. A pályákon előre haladva elérhetőek lesznek új karakterek is. A karakterek között az 1, 2, 3 számgombok segítségével lehet váltani. </w:t>
+      </w:r>
+      <w:r>
+        <w:t xml:space="preserve">A pályákon veszélyes tüskék találhatók, ezek kikerülésére az ugrás mellett segíthet még az ugró pad, illetve különböző színű gombok </w:t>
+      </w:r>
+      <w:r>
+        <w:lastRenderedPageBreak/>
+        <w:t xml:space="preserve">megnyomásával mozgathatók kapuk is. </w:t>
+      </w:r>
+      <w:r>
+        <w:t>A csillagok gyűjtése nem kötelező, viszont némelyik pálya feloldásához kell bizonyos mennyiségű csillag.</w:t>
+      </w:r>
+    </w:p>
+    <w:p>
+      <w:r>
+        <w:t xml:space="preserve">Miután Egyjátékosban fel lett oldva új karakter elérhetővé válik a Többjátékos mód egykét pályája. Itt egyszerre két karakter van a pályán, amelyeket külön gombokkal, egyszerre is lehet mozgatni. Az egyiket az egyjátékosban megszokott A, D és W gombok mozgatják, míg a másikat a balra, jobbra és fel nyilak irányítják. </w:t>
+      </w:r>
+      <w:r>
+        <w:t>Többjátékosban öt pálya tartozik egy csoportba, és így ötösével más két karakter van egyszerre a pályákon.</w:t>
+      </w:r>
+    </w:p>
+    <w:p>
+      <w:r>
+        <w:t xml:space="preserve">A program egyes részeinek megkönnyítésére készítettem gyorsgombokat bizonyos funkciókhoz. A legtöbb pause menü megnyitható az Esc gomb megnyomásával, ha esetleg aktív a menü akkor pedig bezáródik. Az R billentyűvel újrakezdhető egy pálya, ha meg van nyitva a pause menü, vagy éppen aktív a vesztes vagy nyertes panel. A Space billentyűhöz is tartozik némi funkció, amikor a vesztes vagy nyertes panel látható. A nyertes panel esetén a következő pálya gomb helyett lehet használni, a vesztes panel esetén pedig az újrakezdést hívja meg. </w:t>
       </w:r>
     </w:p>
     <w:p>
@@ -2549,6 +2614,7 @@
   <w:style w:type="character" w:default="1" w:styleId="Bekezdsalapbettpusa">
     <w:name w:val="Default Paragraph Font"/>
     <w:uiPriority w:val="1"/>
+    <w:semiHidden/>
     <w:unhideWhenUsed/>
   </w:style>
   <w:style w:type="table" w:default="1" w:styleId="Normltblzat">

</xml_diff>

<commit_message>
3. Mérföldkő Implementáció (60-70 %-os) bemutatása
</commit_message>
<xml_diff>
--- a/Szakdolgozat.docx
+++ b/Szakdolgozat.docx
@@ -148,9 +148,11 @@
         <w:pStyle w:val="Cm"/>
         <w:spacing w:before="2880" w:after="3600"/>
       </w:pPr>
+      <w:proofErr w:type="spellStart"/>
       <w:r>
         <w:t>PuzzlePlatformer</w:t>
       </w:r>
+      <w:proofErr w:type="spellEnd"/>
     </w:p>
     <w:p>
       <w:pPr>
@@ -230,7 +232,15 @@
         <w:tab/>
       </w:r>
       <w:r>
-        <w:t>Programtervező informatikus BSc.</w:t>
+        <w:t xml:space="preserve">Programtervező informatikus </w:t>
+      </w:r>
+      <w:proofErr w:type="spellStart"/>
+      <w:r>
+        <w:t>BSc</w:t>
+      </w:r>
+      <w:proofErr w:type="spellEnd"/>
+      <w:r>
+        <w:t>.</w:t>
       </w:r>
       <w:r>
         <w:tab/>
@@ -353,8 +363,10 @@
             <w:rPr>
               <w:rFonts w:eastAsiaTheme="minorEastAsia"/>
               <w:noProof/>
-              <w:sz w:val="22"/>
+              <w:kern w:val="2"/>
+              <w:szCs w:val="24"/>
               <w:lang w:eastAsia="hu-HU"/>
+              <w14:ligatures w14:val="standardContextual"/>
             </w:rPr>
           </w:pPr>
           <w:r>
@@ -366,7 +378,7 @@
           <w:r>
             <w:fldChar w:fldCharType="separate"/>
           </w:r>
-          <w:hyperlink w:anchor="_Toc87521353" w:history="1">
+          <w:hyperlink w:anchor="_Toc228099596" w:history="1">
             <w:r>
               <w:rPr>
                 <w:rStyle w:val="Hiperhivatkozs"/>
@@ -378,8 +390,10 @@
               <w:rPr>
                 <w:rFonts w:eastAsiaTheme="minorEastAsia"/>
                 <w:noProof/>
-                <w:sz w:val="22"/>
+                <w:kern w:val="2"/>
+                <w:szCs w:val="24"/>
                 <w:lang w:eastAsia="hu-HU"/>
+                <w14:ligatures w14:val="standardContextual"/>
               </w:rPr>
               <w:tab/>
             </w:r>
@@ -409,7 +423,7 @@
                 <w:noProof/>
                 <w:webHidden/>
               </w:rPr>
-              <w:instrText xml:space="preserve"> PAGEREF _Toc87521353 \h </w:instrText>
+              <w:instrText xml:space="preserve"> PAGEREF _Toc228099596 \h </w:instrText>
             </w:r>
             <w:r>
               <w:rPr>
@@ -450,11 +464,13 @@
             <w:rPr>
               <w:rFonts w:eastAsiaTheme="minorEastAsia"/>
               <w:noProof/>
-              <w:sz w:val="22"/>
+              <w:kern w:val="2"/>
+              <w:szCs w:val="24"/>
               <w:lang w:eastAsia="hu-HU"/>
+              <w14:ligatures w14:val="standardContextual"/>
             </w:rPr>
           </w:pPr>
-          <w:hyperlink w:anchor="_Toc87521354" w:history="1">
+          <w:hyperlink w:anchor="_Toc228099597" w:history="1">
             <w:r>
               <w:rPr>
                 <w:rStyle w:val="Hiperhivatkozs"/>
@@ -466,8 +482,10 @@
               <w:rPr>
                 <w:rFonts w:eastAsiaTheme="minorEastAsia"/>
                 <w:noProof/>
-                <w:sz w:val="22"/>
+                <w:kern w:val="2"/>
+                <w:szCs w:val="24"/>
                 <w:lang w:eastAsia="hu-HU"/>
+                <w14:ligatures w14:val="standardContextual"/>
               </w:rPr>
               <w:tab/>
             </w:r>
@@ -497,7 +515,7 @@
                 <w:noProof/>
                 <w:webHidden/>
               </w:rPr>
-              <w:instrText xml:space="preserve"> PAGEREF _Toc87521354 \h </w:instrText>
+              <w:instrText xml:space="preserve"> PAGEREF _Toc228099597 \h </w:instrText>
             </w:r>
             <w:r>
               <w:rPr>
@@ -538,11 +556,13 @@
             <w:rPr>
               <w:rFonts w:eastAsiaTheme="minorEastAsia"/>
               <w:noProof/>
-              <w:sz w:val="22"/>
+              <w:kern w:val="2"/>
+              <w:szCs w:val="24"/>
               <w:lang w:eastAsia="hu-HU"/>
+              <w14:ligatures w14:val="standardContextual"/>
             </w:rPr>
           </w:pPr>
-          <w:hyperlink w:anchor="_Toc87521355" w:history="1">
+          <w:hyperlink w:anchor="_Toc228099598" w:history="1">
             <w:r>
               <w:rPr>
                 <w:rStyle w:val="Hiperhivatkozs"/>
@@ -554,8 +574,10 @@
               <w:rPr>
                 <w:rFonts w:eastAsiaTheme="minorEastAsia"/>
                 <w:noProof/>
-                <w:sz w:val="22"/>
+                <w:kern w:val="2"/>
+                <w:szCs w:val="24"/>
                 <w:lang w:eastAsia="hu-HU"/>
+                <w14:ligatures w14:val="standardContextual"/>
               </w:rPr>
               <w:tab/>
             </w:r>
@@ -585,7 +607,7 @@
                 <w:noProof/>
                 <w:webHidden/>
               </w:rPr>
-              <w:instrText xml:space="preserve"> PAGEREF _Toc87521355 \h </w:instrText>
+              <w:instrText xml:space="preserve"> PAGEREF _Toc228099598 \h </w:instrText>
             </w:r>
             <w:r>
               <w:rPr>
@@ -605,7 +627,7 @@
                 <w:noProof/>
                 <w:webHidden/>
               </w:rPr>
-              <w:t>4</w:t>
+              <w:t>5</w:t>
             </w:r>
             <w:r>
               <w:rPr>
@@ -626,11 +648,13 @@
             <w:rPr>
               <w:rFonts w:eastAsiaTheme="minorEastAsia"/>
               <w:noProof/>
-              <w:sz w:val="22"/>
+              <w:kern w:val="2"/>
+              <w:szCs w:val="24"/>
               <w:lang w:eastAsia="hu-HU"/>
+              <w14:ligatures w14:val="standardContextual"/>
             </w:rPr>
           </w:pPr>
-          <w:hyperlink w:anchor="_Toc87521356" w:history="1">
+          <w:hyperlink w:anchor="_Toc228099599" w:history="1">
             <w:r>
               <w:rPr>
                 <w:rStyle w:val="Hiperhivatkozs"/>
@@ -642,8 +666,10 @@
               <w:rPr>
                 <w:rFonts w:eastAsiaTheme="minorEastAsia"/>
                 <w:noProof/>
-                <w:sz w:val="22"/>
+                <w:kern w:val="2"/>
+                <w:szCs w:val="24"/>
                 <w:lang w:eastAsia="hu-HU"/>
+                <w14:ligatures w14:val="standardContextual"/>
               </w:rPr>
               <w:tab/>
             </w:r>
@@ -673,7 +699,7 @@
                 <w:noProof/>
                 <w:webHidden/>
               </w:rPr>
-              <w:instrText xml:space="preserve"> PAGEREF _Toc87521356 \h </w:instrText>
+              <w:instrText xml:space="preserve"> PAGEREF _Toc228099599 \h </w:instrText>
             </w:r>
             <w:r>
               <w:rPr>
@@ -693,7 +719,7 @@
                 <w:noProof/>
                 <w:webHidden/>
               </w:rPr>
-              <w:t>6</w:t>
+              <w:t>10</w:t>
             </w:r>
             <w:r>
               <w:rPr>
@@ -714,11 +740,13 @@
             <w:rPr>
               <w:rFonts w:eastAsiaTheme="minorEastAsia"/>
               <w:noProof/>
-              <w:sz w:val="22"/>
+              <w:kern w:val="2"/>
+              <w:szCs w:val="24"/>
               <w:lang w:eastAsia="hu-HU"/>
+              <w14:ligatures w14:val="standardContextual"/>
             </w:rPr>
           </w:pPr>
-          <w:hyperlink w:anchor="_Toc87521357" w:history="1">
+          <w:hyperlink w:anchor="_Toc228099600" w:history="1">
             <w:r>
               <w:rPr>
                 <w:rStyle w:val="Hiperhivatkozs"/>
@@ -730,8 +758,10 @@
               <w:rPr>
                 <w:rFonts w:eastAsiaTheme="minorEastAsia"/>
                 <w:noProof/>
-                <w:sz w:val="22"/>
+                <w:kern w:val="2"/>
+                <w:szCs w:val="24"/>
                 <w:lang w:eastAsia="hu-HU"/>
+                <w14:ligatures w14:val="standardContextual"/>
               </w:rPr>
               <w:tab/>
             </w:r>
@@ -761,7 +791,7 @@
                 <w:noProof/>
                 <w:webHidden/>
               </w:rPr>
-              <w:instrText xml:space="preserve"> PAGEREF _Toc87521357 \h </w:instrText>
+              <w:instrText xml:space="preserve"> PAGEREF _Toc228099600 \h </w:instrText>
             </w:r>
             <w:r>
               <w:rPr>
@@ -781,7 +811,7 @@
                 <w:noProof/>
                 <w:webHidden/>
               </w:rPr>
-              <w:t>7</w:t>
+              <w:t>11</w:t>
             </w:r>
             <w:r>
               <w:rPr>
@@ -802,11 +832,13 @@
             <w:rPr>
               <w:rFonts w:eastAsiaTheme="minorEastAsia"/>
               <w:noProof/>
-              <w:sz w:val="22"/>
+              <w:kern w:val="2"/>
+              <w:szCs w:val="24"/>
               <w:lang w:eastAsia="hu-HU"/>
+              <w14:ligatures w14:val="standardContextual"/>
             </w:rPr>
           </w:pPr>
-          <w:hyperlink w:anchor="_Toc87521358" w:history="1">
+          <w:hyperlink w:anchor="_Toc228099601" w:history="1">
             <w:r>
               <w:rPr>
                 <w:rStyle w:val="Hiperhivatkozs"/>
@@ -818,8 +850,10 @@
               <w:rPr>
                 <w:rFonts w:eastAsiaTheme="minorEastAsia"/>
                 <w:noProof/>
-                <w:sz w:val="22"/>
+                <w:kern w:val="2"/>
+                <w:szCs w:val="24"/>
                 <w:lang w:eastAsia="hu-HU"/>
+                <w14:ligatures w14:val="standardContextual"/>
               </w:rPr>
               <w:tab/>
             </w:r>
@@ -849,7 +883,7 @@
                 <w:noProof/>
                 <w:webHidden/>
               </w:rPr>
-              <w:instrText xml:space="preserve"> PAGEREF _Toc87521358 \h </w:instrText>
+              <w:instrText xml:space="preserve"> PAGEREF _Toc228099601 \h </w:instrText>
             </w:r>
             <w:r>
               <w:rPr>
@@ -869,7 +903,7 @@
                 <w:noProof/>
                 <w:webHidden/>
               </w:rPr>
-              <w:t>8</w:t>
+              <w:t>12</w:t>
             </w:r>
             <w:r>
               <w:rPr>
@@ -903,7 +937,7 @@
       <w:pPr>
         <w:pStyle w:val="Cmsor1"/>
       </w:pPr>
-      <w:bookmarkStart w:id="0" w:name="_Toc87521353"/>
+      <w:bookmarkStart w:id="0" w:name="_Toc228099596"/>
       <w:r>
         <w:lastRenderedPageBreak/>
         <w:t>Bevezet</w:t>
@@ -915,7 +949,15 @@
     </w:p>
     <w:p>
       <w:r>
-        <w:t>Ez a dokumentum a PuzzlePlatformer nevű programhoz készült dokumentáció és szakdolgozat.</w:t>
+        <w:t xml:space="preserve">Ez a dokumentum a </w:t>
+      </w:r>
+      <w:proofErr w:type="spellStart"/>
+      <w:r>
+        <w:t>PuzzlePlatformer</w:t>
+      </w:r>
+      <w:proofErr w:type="spellEnd"/>
+      <w:r>
+        <w:t xml:space="preserve"> nevű programhoz készült dokumentáció és szakdolgozat.</w:t>
       </w:r>
     </w:p>
     <w:p>
@@ -925,8 +967,21 @@
       <w:r>
         <w:t xml:space="preserve"> </w:t>
       </w:r>
-      <w:r>
-        <w:t xml:space="preserve">Unityben készül, ahol lesz menürendszer és 2D-s platformer pályák, amiken különböző rejtvényeket megoldva kell átjutni. A menüben lesz egy kilépés gomb, amivel bezárható a program. </w:t>
+      <w:proofErr w:type="spellStart"/>
+      <w:r>
+        <w:t>Unityben</w:t>
+      </w:r>
+      <w:proofErr w:type="spellEnd"/>
+      <w:r>
+        <w:t xml:space="preserve"> készül, ahol lesz menürendszer és 2D-s </w:t>
+      </w:r>
+      <w:proofErr w:type="spellStart"/>
+      <w:r>
+        <w:t>platformer</w:t>
+      </w:r>
+      <w:proofErr w:type="spellEnd"/>
+      <w:r>
+        <w:t xml:space="preserve"> pályák, amiken különböző rejtvényeket megoldva kell átjutni. A menüben lesz egy kilépés gomb, amivel bezárható a program. </w:t>
       </w:r>
       <w:r>
         <w:t xml:space="preserve">Lesz egy beállítások gomb, ami </w:t>
@@ -999,7 +1054,7 @@
         <w:spacing w:before="24000"/>
         <w:ind w:left="431" w:hanging="431"/>
       </w:pPr>
-      <w:bookmarkStart w:id="1" w:name="_Toc87521354"/>
+      <w:bookmarkStart w:id="1" w:name="_Toc228099597"/>
       <w:r>
         <w:lastRenderedPageBreak/>
         <w:t>Felhasználói dokumentáció</w:t>
@@ -1008,7 +1063,23 @@
     </w:p>
     <w:p>
       <w:r>
-        <w:t>A PuzzlePlatformer játék egy Unityben készült alkalmazás. A programban egy menürendszer köszönt elindítás után, ahol beállításokat lehet módosítani</w:t>
+        <w:t xml:space="preserve">A </w:t>
+      </w:r>
+      <w:proofErr w:type="spellStart"/>
+      <w:r>
+        <w:t>PuzzlePlatformer</w:t>
+      </w:r>
+      <w:proofErr w:type="spellEnd"/>
+      <w:r>
+        <w:t xml:space="preserve"> játék egy </w:t>
+      </w:r>
+      <w:proofErr w:type="spellStart"/>
+      <w:r>
+        <w:t>Unityben</w:t>
+      </w:r>
+      <w:proofErr w:type="spellEnd"/>
+      <w:r>
+        <w:t xml:space="preserve"> készült alkalmazás. A programban egy menürendszer köszönt elindítás után, ahol beállításokat lehet módosítani</w:t>
       </w:r>
       <w:r>
         <w:t>, bezárni az alkalmazást vagy elindítani a játékot.</w:t>
@@ -1035,7 +1106,13 @@
         <w:t xml:space="preserve">megnyomva </w:t>
       </w:r>
       <w:r>
-        <w:t>kiválasztható egyjátékos vagy többjátékos mód. A többjátékos elkezdéséhez legalább az első 3 pályát teljesíteni kell az egyjátékos módban, hogy legyen kettő karakter</w:t>
+        <w:t xml:space="preserve">kiválasztható egyjátékos vagy többjátékos mód. A többjátékos elkezdéséhez legalább az első </w:t>
+      </w:r>
+      <w:r>
+        <w:t>három</w:t>
+      </w:r>
+      <w:r>
+        <w:t xml:space="preserve"> pályát teljesíteni kell az egyjátékos módban, hogy legyen kettő karakter</w:t>
       </w:r>
       <w:r>
         <w:t>,</w:t>
@@ -1067,13 +1144,37 @@
         <w:t xml:space="preserve"> program kódjában létrehozott</w:t>
       </w:r>
       <w:r>
-        <w:t xml:space="preserve"> legtöbb osztályt, a MonoBehaviour osztályból</w:t>
+        <w:t xml:space="preserve"> legtöbb osztályt, a </w:t>
+      </w:r>
+      <w:proofErr w:type="spellStart"/>
+      <w:r>
+        <w:t>MonoBehaviour</w:t>
+      </w:r>
+      <w:proofErr w:type="spellEnd"/>
+      <w:r>
+        <w:t xml:space="preserve"> osztályból</w:t>
       </w:r>
       <w:r>
         <w:t xml:space="preserve"> van származtatva</w:t>
       </w:r>
       <w:r>
-        <w:t>, ezzel a létrehozott osztályok tartalmazzák a szükséges tulajdonságokat, hogy egy unity-s objektumhoz köthetőek legyenek. Ezt kihasználva olyan osztályokat és függvényeket írtam, amelyek akár többször is felhasználhatóak, különböző objektumokhoz rendelve. Például a PlayerMovement osztály</w:t>
+        <w:t xml:space="preserve">, ezzel a létrehozott osztályok tartalmazzák a szükséges tulajdonságokat, hogy egy </w:t>
+      </w:r>
+      <w:proofErr w:type="spellStart"/>
+      <w:r>
+        <w:t>unity</w:t>
+      </w:r>
+      <w:proofErr w:type="spellEnd"/>
+      <w:r>
+        <w:t xml:space="preserve">-s objektumhoz köthetőek legyenek. Ezt kihasználva olyan osztályokat és függvényeket írtam, amelyek akár többször is felhasználhatóak, különböző objektumokhoz rendelve. Például a </w:t>
+      </w:r>
+      <w:proofErr w:type="spellStart"/>
+      <w:r>
+        <w:t>PlayerMovement</w:t>
+      </w:r>
+      <w:proofErr w:type="spellEnd"/>
+      <w:r>
+        <w:t xml:space="preserve"> osztály</w:t>
       </w:r>
       <w:r>
         <w:t xml:space="preserve">, amely </w:t>
@@ -1138,14 +1239,27 @@
                                 <w:szCs w:val="22"/>
                               </w:rPr>
                             </w:pPr>
-                            <w:fldSimple w:instr=" SEQ ábra \* ARABIC ">
-                              <w:r>
-                                <w:rPr>
-                                  <w:noProof/>
-                                </w:rPr>
-                                <w:t>1</w:t>
-                              </w:r>
-                            </w:fldSimple>
+                            <w:r>
+                              <w:fldChar w:fldCharType="begin"/>
+                            </w:r>
+                            <w:r>
+                              <w:instrText xml:space="preserve"> SEQ ábra \* ARABIC </w:instrText>
+                            </w:r>
+                            <w:r>
+                              <w:fldChar w:fldCharType="separate"/>
+                            </w:r>
+                            <w:r>
+                              <w:rPr>
+                                <w:noProof/>
+                              </w:rPr>
+                              <w:t>1</w:t>
+                            </w:r>
+                            <w:r>
+                              <w:rPr>
+                                <w:noProof/>
+                              </w:rPr>
+                              <w:fldChar w:fldCharType="end"/>
+                            </w:r>
                             <w:r>
                               <w:t>. ábra Főmenü, Játék feliraton a kurzor</w:t>
                             </w:r>
@@ -1180,14 +1294,27 @@
                           <w:szCs w:val="22"/>
                         </w:rPr>
                       </w:pPr>
-                      <w:fldSimple w:instr=" SEQ ábra \* ARABIC ">
-                        <w:r>
-                          <w:rPr>
-                            <w:noProof/>
-                          </w:rPr>
-                          <w:t>1</w:t>
-                        </w:r>
-                      </w:fldSimple>
+                      <w:r>
+                        <w:fldChar w:fldCharType="begin"/>
+                      </w:r>
+                      <w:r>
+                        <w:instrText xml:space="preserve"> SEQ ábra \* ARABIC </w:instrText>
+                      </w:r>
+                      <w:r>
+                        <w:fldChar w:fldCharType="separate"/>
+                      </w:r>
+                      <w:r>
+                        <w:rPr>
+                          <w:noProof/>
+                        </w:rPr>
+                        <w:t>1</w:t>
+                      </w:r>
+                      <w:r>
+                        <w:rPr>
+                          <w:noProof/>
+                        </w:rPr>
+                        <w:fldChar w:fldCharType="end"/>
+                      </w:r>
                       <w:r>
                         <w:t>. ábra Főmenü, Játék feliraton a kurzor</w:t>
                       </w:r>
@@ -1201,6 +1328,9 @@
         </mc:AlternateContent>
       </w:r>
       <w:r>
+        <w:rPr>
+          <w:noProof/>
+        </w:rPr>
         <w:drawing>
           <wp:anchor distT="0" distB="0" distL="114300" distR="114300" simplePos="0" relativeHeight="251659264" behindDoc="1" locked="0" layoutInCell="1" allowOverlap="1" wp14:anchorId="0A982752" wp14:editId="77248AB3">
             <wp:simplePos x="0" y="0"/>
@@ -1281,13 +1411,155 @@
         <w:t xml:space="preserve"> ha csak felé húzzuk a kurzort, jobb oldalt megjelenik egy rövid leírás az opcióval kapcsolatban. A </w:t>
       </w:r>
       <w:r>
-        <w:t xml:space="preserve">Játék szövegre kattintva egy kisebb ablak jelenik meg, ahol kiválasztható a játékmód, egy- vagy többjátékos, illetve a </w:t>
+        <w:t>Játék szövegre kattintva egy kisebb ablak jelenik meg, ahol kiválasztható a játékmód</w:t>
+      </w:r>
+      <w:r>
+        <w:t xml:space="preserve"> (</w:t>
+      </w:r>
+      <w:r>
+        <w:rPr>
+          <w:i/>
+          <w:iCs/>
+        </w:rPr>
+        <w:fldChar w:fldCharType="begin"/>
+      </w:r>
+      <w:r>
+        <w:rPr>
+          <w:i/>
+          <w:iCs/>
+        </w:rPr>
+        <w:instrText xml:space="preserve"> REF _Ref228097648 \h </w:instrText>
+      </w:r>
+      <w:r>
+        <w:rPr>
+          <w:i/>
+          <w:iCs/>
+        </w:rPr>
+      </w:r>
+      <w:r>
+        <w:rPr>
+          <w:i/>
+          <w:iCs/>
+        </w:rPr>
+        <w:instrText xml:space="preserve"> \* MERGEFORMAT </w:instrText>
+      </w:r>
+      <w:r>
+        <w:rPr>
+          <w:i/>
+          <w:iCs/>
+        </w:rPr>
+        <w:fldChar w:fldCharType="separate"/>
+      </w:r>
+      <w:r>
+        <w:rPr>
+          <w:i/>
+          <w:iCs/>
+          <w:noProof/>
+        </w:rPr>
+        <w:t>6</w:t>
+      </w:r>
+      <w:r>
+        <w:rPr>
+          <w:i/>
+          <w:iCs/>
+        </w:rPr>
+        <w:t>. ábra Játék mód választó panel</w:t>
+      </w:r>
+      <w:r>
+        <w:rPr>
+          <w:i/>
+          <w:iCs/>
+        </w:rPr>
+        <w:fldChar w:fldCharType="end"/>
+      </w:r>
+      <w:r>
+        <w:t>)</w:t>
+      </w:r>
+      <w:r>
+        <w:t xml:space="preserve">, egy- vagy többjátékos, illetve a </w:t>
       </w:r>
       <w:r>
         <w:t>mégse</w:t>
       </w:r>
       <w:r>
-        <w:t xml:space="preserve"> gombbal bezárható ez a kis választó felület. A Beállítások-at kiválasztva is megjelenik egy panel, ahol módosítható a program hangereje, felbontása és ablakmódja. Az utóbbi három opciót, míg a felbontás a használt monitortól függően különböző mennyiségű opciót tartalmazhat. A vissza gombbal</w:t>
+        <w:t xml:space="preserve"> gombbal bezárható ez a kis választó felület. A Beállítások-</w:t>
+      </w:r>
+      <w:proofErr w:type="spellStart"/>
+      <w:r>
+        <w:t>at</w:t>
+      </w:r>
+      <w:proofErr w:type="spellEnd"/>
+      <w:r>
+        <w:t xml:space="preserve"> kiválasztva is megjelenik egy panel</w:t>
+      </w:r>
+      <w:r>
+        <w:t xml:space="preserve"> (</w:t>
+      </w:r>
+      <w:r>
+        <w:rPr>
+          <w:i/>
+          <w:iCs/>
+        </w:rPr>
+        <w:fldChar w:fldCharType="begin"/>
+      </w:r>
+      <w:r>
+        <w:rPr>
+          <w:i/>
+          <w:iCs/>
+        </w:rPr>
+        <w:instrText xml:space="preserve"> REF _Ref228097428 \h </w:instrText>
+      </w:r>
+      <w:r>
+        <w:rPr>
+          <w:i/>
+          <w:iCs/>
+        </w:rPr>
+      </w:r>
+      <w:r>
+        <w:rPr>
+          <w:i/>
+          <w:iCs/>
+        </w:rPr>
+        <w:instrText xml:space="preserve"> \* MERGEFORMAT </w:instrText>
+      </w:r>
+      <w:r>
+        <w:rPr>
+          <w:i/>
+          <w:iCs/>
+        </w:rPr>
+        <w:fldChar w:fldCharType="separate"/>
+      </w:r>
+      <w:r>
+        <w:rPr>
+          <w:i/>
+          <w:iCs/>
+          <w:noProof/>
+        </w:rPr>
+        <w:t>5</w:t>
+      </w:r>
+      <w:r>
+        <w:rPr>
+          <w:i/>
+          <w:iCs/>
+        </w:rPr>
+        <w:t>. ábra Beállítások főmenü</w:t>
+      </w:r>
+      <w:r>
+        <w:rPr>
+          <w:i/>
+          <w:iCs/>
+        </w:rPr>
+        <w:fldChar w:fldCharType="end"/>
+      </w:r>
+      <w:r>
+        <w:t>)</w:t>
+      </w:r>
+      <w:r>
+        <w:t xml:space="preserve">, ahol módosítható a program hangereje, felbontása és ablakmódja. Az utóbbi három opciót, míg a felbontás a használt monitortól függően különböző mennyiségű </w:t>
+      </w:r>
+      <w:r>
+        <w:lastRenderedPageBreak/>
+        <w:t>opciót tartalmazhat. A vissza gombbal</w:t>
       </w:r>
       <w:r>
         <w:t xml:space="preserve"> lehet visszalépni az eredeti menüre. A</w:t>
@@ -1307,7 +1579,6 @@
         <w:rPr>
           <w:noProof/>
         </w:rPr>
-        <w:lastRenderedPageBreak/>
         <mc:AlternateContent>
           <mc:Choice Requires="wps">
             <w:drawing>
@@ -1418,6 +1689,9 @@
         </mc:AlternateContent>
       </w:r>
       <w:r>
+        <w:rPr>
+          <w:noProof/>
+        </w:rPr>
         <w:drawing>
           <wp:anchor distT="0" distB="0" distL="114300" distR="114300" simplePos="0" relativeHeight="251662336" behindDoc="1" locked="0" layoutInCell="1" allowOverlap="1" wp14:anchorId="2B6950F0" wp14:editId="7C36A5D4">
             <wp:simplePos x="0" y="0"/>
@@ -1622,6 +1896,9 @@
         </mc:AlternateContent>
       </w:r>
       <w:r>
+        <w:rPr>
+          <w:noProof/>
+        </w:rPr>
         <w:drawing>
           <wp:anchor distT="0" distB="0" distL="114300" distR="114300" simplePos="0" relativeHeight="251665408" behindDoc="1" locked="0" layoutInCell="1" allowOverlap="1" wp14:anchorId="1ECFF694" wp14:editId="1FE18B2A">
             <wp:simplePos x="0" y="0"/>
@@ -1702,35 +1979,187 @@
         <w:t xml:space="preserve">egyszerre két karakter van, amelyeket külön gombokkal, egyszerre is lehet mozgatni. Az egyiket az egyjátékosban megszokott A, D és W gombok mozgatják, míg a másikat a balra, jobbra és fel nyilak irányítják. </w:t>
       </w:r>
       <w:r>
-        <w:t>Többjátékosban öt pálya tartozik egy csoportba, és így ötösével más két karakter van egyszerre a pályákon.</w:t>
+        <w:t>Többjátékosban öt pálya tartozik egy csoportba</w:t>
+      </w:r>
+      <w:r>
+        <w:t xml:space="preserve"> (</w:t>
+      </w:r>
+      <w:r>
+        <w:rPr>
+          <w:i/>
+          <w:iCs/>
+        </w:rPr>
+        <w:fldChar w:fldCharType="begin"/>
+      </w:r>
+      <w:r>
+        <w:rPr>
+          <w:i/>
+          <w:iCs/>
+        </w:rPr>
+        <w:instrText xml:space="preserve"> REF _Ref228099537 \h </w:instrText>
+      </w:r>
+      <w:r>
+        <w:rPr>
+          <w:i/>
+          <w:iCs/>
+        </w:rPr>
+      </w:r>
+      <w:r>
+        <w:rPr>
+          <w:i/>
+          <w:iCs/>
+        </w:rPr>
+        <w:instrText xml:space="preserve"> \* MERGEFORMAT </w:instrText>
+      </w:r>
+      <w:r>
+        <w:rPr>
+          <w:i/>
+          <w:iCs/>
+        </w:rPr>
+        <w:fldChar w:fldCharType="separate"/>
+      </w:r>
+      <w:r>
+        <w:rPr>
+          <w:i/>
+          <w:iCs/>
+          <w:noProof/>
+        </w:rPr>
+        <w:t>7</w:t>
+      </w:r>
+      <w:r>
+        <w:rPr>
+          <w:i/>
+          <w:iCs/>
+        </w:rPr>
+        <w:t>. ábra Többjátékos térkép</w:t>
+      </w:r>
+      <w:r>
+        <w:rPr>
+          <w:i/>
+          <w:iCs/>
+        </w:rPr>
+        <w:fldChar w:fldCharType="end"/>
+      </w:r>
+      <w:r>
+        <w:t>)</w:t>
+      </w:r>
+      <w:r>
+        <w:t>, és így ötösével más két karakter van egyszerre a pályákon.</w:t>
       </w:r>
     </w:p>
     <w:p>
       <w:r>
-        <w:t xml:space="preserve">A program egyes részeinek megkönnyítésére készítettem gyorsgombokat bizonyos funkciókhoz. A legtöbb pause menü megnyitható az Esc gomb megnyomásával, ha esetleg aktív a menü akkor pedig bezáródik. Az R billentyűvel újrakezdhető egy pálya, ha meg van nyitva a pause menü, vagy éppen aktív a vesztes vagy nyertes panel. A Space billentyűhöz is tartozik némi funkció, amikor a vesztes vagy nyertes panel látható. A nyertes panel esetén a </w:t>
+        <w:t xml:space="preserve">A program egyes részeinek megkönnyítésére készítettem gyorsgombokat bizonyos funkciókhoz. A legtöbb </w:t>
+      </w:r>
+      <w:proofErr w:type="spellStart"/>
+      <w:r>
+        <w:t>pause</w:t>
+      </w:r>
+      <w:proofErr w:type="spellEnd"/>
+      <w:r>
+        <w:t xml:space="preserve"> menü megnyitható</w:t>
+      </w:r>
+      <w:r>
+        <w:t xml:space="preserve"> (</w:t>
+      </w:r>
+      <w:r>
+        <w:rPr>
+          <w:i/>
+          <w:iCs/>
+        </w:rPr>
+        <w:fldChar w:fldCharType="begin"/>
+      </w:r>
+      <w:r>
+        <w:rPr>
+          <w:i/>
+          <w:iCs/>
+        </w:rPr>
+        <w:instrText xml:space="preserve"> REF _Ref228099570 \h </w:instrText>
+      </w:r>
+      <w:r>
+        <w:rPr>
+          <w:i/>
+          <w:iCs/>
+        </w:rPr>
+      </w:r>
+      <w:r>
+        <w:rPr>
+          <w:i/>
+          <w:iCs/>
+        </w:rPr>
+        <w:instrText xml:space="preserve"> \* MERGEFORMAT </w:instrText>
+      </w:r>
+      <w:r>
+        <w:rPr>
+          <w:i/>
+          <w:iCs/>
+        </w:rPr>
+        <w:fldChar w:fldCharType="separate"/>
+      </w:r>
+      <w:r>
+        <w:rPr>
+          <w:i/>
+          <w:iCs/>
+          <w:noProof/>
+        </w:rPr>
+        <w:t>8</w:t>
+      </w:r>
+      <w:r>
+        <w:rPr>
+          <w:i/>
+          <w:iCs/>
+        </w:rPr>
+        <w:t>. ábra Térkép menü</w:t>
+      </w:r>
+      <w:r>
+        <w:rPr>
+          <w:i/>
+          <w:iCs/>
+        </w:rPr>
+        <w:fldChar w:fldCharType="end"/>
+      </w:r>
+      <w:r>
+        <w:t>)</w:t>
+      </w:r>
+      <w:r>
+        <w:t xml:space="preserve"> az </w:t>
+      </w:r>
+      <w:proofErr w:type="spellStart"/>
+      <w:r>
+        <w:t>Esc</w:t>
+      </w:r>
+      <w:proofErr w:type="spellEnd"/>
+      <w:r>
+        <w:t xml:space="preserve"> gomb </w:t>
       </w:r>
       <w:r>
         <w:lastRenderedPageBreak/>
-        <w:t>következő pálya gomb helyett lehet használni, a vesztes panel esetén pedig az újrakezdést hívja meg.</w:t>
-      </w:r>
-    </w:p>
-    <w:p>
-      <w:pPr>
-        <w:rPr>
-          <w:rFonts w:asciiTheme="majorHAnsi" w:eastAsiaTheme="majorEastAsia" w:hAnsiTheme="majorHAnsi" w:cstheme="majorBidi"/>
-          <w:sz w:val="32"/>
-          <w:szCs w:val="32"/>
-        </w:rPr>
-      </w:pPr>
-      <w:r>
-        <w:br w:type="page"/>
+        <w:t xml:space="preserve">megnyomásával, ha esetleg aktív a menü akkor pedig bezáródik. Az R billentyűvel újrakezdhető egy pálya, ha meg van nyitva a </w:t>
+      </w:r>
+      <w:proofErr w:type="spellStart"/>
+      <w:r>
+        <w:t>pause</w:t>
+      </w:r>
+      <w:proofErr w:type="spellEnd"/>
+      <w:r>
+        <w:t xml:space="preserve"> menü, vagy éppen aktív a vesztes vagy nyertes panel. A </w:t>
+      </w:r>
+      <w:proofErr w:type="spellStart"/>
+      <w:r>
+        <w:t>Space</w:t>
+      </w:r>
+      <w:proofErr w:type="spellEnd"/>
+      <w:r>
+        <w:t xml:space="preserve"> billentyűhöz is tartozik némi funkció, amikor a vesztes vagy nyertes panel látható. A nyertes panel esetén a következő pálya gomb helyett lehet használni, a vesztes panel esetén pedig az újrakezdést hívja meg.</w:t>
       </w:r>
     </w:p>
     <w:p>
       <w:pPr>
         <w:pStyle w:val="Cmsor1"/>
+        <w:spacing w:before="24000"/>
+        <w:ind w:left="431" w:hanging="431"/>
       </w:pPr>
-      <w:bookmarkStart w:id="2" w:name="_Toc87521355"/>
+      <w:bookmarkStart w:id="2" w:name="_Toc228099598"/>
       <w:r>
         <w:lastRenderedPageBreak/>
         <w:t>Fejlesztői dokumentáció</w:t>
@@ -1773,11 +2202,24 @@
       </w:r>
     </w:p>
     <w:p>
-      <w:r>
-        <w:t>Unity 2022.3.62f2 verzióban készítettem a programot.</w:t>
-      </w:r>
-      <w:r>
-        <w:t xml:space="preserve"> A program kódja C# nyelven van, és a különböző scriptek a Unity-s </w:t>
+      <w:proofErr w:type="spellStart"/>
+      <w:r>
+        <w:t>Unity</w:t>
+      </w:r>
+      <w:proofErr w:type="spellEnd"/>
+      <w:r>
+        <w:t xml:space="preserve"> 2022.3.62f2 verzióban készítettem a programot.</w:t>
+      </w:r>
+      <w:r>
+        <w:t xml:space="preserve"> A program kódja C# nyelven van, és a különböző scriptek a </w:t>
+      </w:r>
+      <w:proofErr w:type="spellStart"/>
+      <w:r>
+        <w:t>Unity</w:t>
+      </w:r>
+      <w:proofErr w:type="spellEnd"/>
+      <w:r>
+        <w:t xml:space="preserve">-s </w:t>
       </w:r>
       <w:r>
         <w:t>objektumo</w:t>
@@ -1789,7 +2231,55 @@
         <w:t>o</w:t>
       </w:r>
       <w:r>
-        <w:t>z vannak rendelve. Unity-ben létrehoztam saját layer-eket, custom típusokat, hogy megvalósítsam a programot. A pályák egy grid-en szereplő több tilemap-ből álló szerkezetben vannak, amelyek 2Ds nézete adja a pálya egészét. Emellett minden pályához tartozik egy háttér is. Mivel a pályákat fájlból tölti be a program, ezért minden pályához tartozik egy json fájl</w:t>
+        <w:t xml:space="preserve">z vannak rendelve. </w:t>
+      </w:r>
+      <w:proofErr w:type="spellStart"/>
+      <w:r>
+        <w:t>Unity</w:t>
+      </w:r>
+      <w:proofErr w:type="spellEnd"/>
+      <w:r>
+        <w:t xml:space="preserve">-ben létrehoztam saját </w:t>
+      </w:r>
+      <w:proofErr w:type="spellStart"/>
+      <w:r>
+        <w:t>layer-eket</w:t>
+      </w:r>
+      <w:proofErr w:type="spellEnd"/>
+      <w:r>
+        <w:t xml:space="preserve">, </w:t>
+      </w:r>
+      <w:proofErr w:type="spellStart"/>
+      <w:r>
+        <w:t>custom</w:t>
+      </w:r>
+      <w:proofErr w:type="spellEnd"/>
+      <w:r>
+        <w:t xml:space="preserve"> típusokat, hogy megvalósítsam a programot. A pályák egy </w:t>
+      </w:r>
+      <w:proofErr w:type="spellStart"/>
+      <w:r>
+        <w:t>grid</w:t>
+      </w:r>
+      <w:proofErr w:type="spellEnd"/>
+      <w:r>
+        <w:t xml:space="preserve">-en szereplő több </w:t>
+      </w:r>
+      <w:proofErr w:type="spellStart"/>
+      <w:r>
+        <w:t>tilemap-ből</w:t>
+      </w:r>
+      <w:proofErr w:type="spellEnd"/>
+      <w:r>
+        <w:t xml:space="preserve"> álló szerkezetben vannak, amelyek 2Ds nézete adja a pálya egészét. Emellett minden pályához tartozik egy háttér is. Mivel a pályákat fájlból tölti be a program, ezért minden pályához tartozik egy </w:t>
+      </w:r>
+      <w:proofErr w:type="spellStart"/>
+      <w:r>
+        <w:t>json</w:t>
+      </w:r>
+      <w:proofErr w:type="spellEnd"/>
+      <w:r>
+        <w:t xml:space="preserve"> fájl</w:t>
       </w:r>
       <w:r>
         <w:t>,</w:t>
@@ -1815,8 +2305,17 @@
         <w:t>ek</w:t>
       </w:r>
       <w:r>
-        <w:t xml:space="preserve"> egy Unity-s </w:t>
-      </w:r>
+        <w:t xml:space="preserve"> egy </w:t>
+      </w:r>
+      <w:proofErr w:type="spellStart"/>
+      <w:r>
+        <w:t>Unity</w:t>
+      </w:r>
+      <w:proofErr w:type="spellEnd"/>
+      <w:r>
+        <w:t xml:space="preserve">-s </w:t>
+      </w:r>
+      <w:proofErr w:type="spellStart"/>
       <w:r>
         <w:t>G</w:t>
       </w:r>
@@ -1827,11 +2326,16 @@
         <w:t>O</w:t>
       </w:r>
       <w:r>
-        <w:t xml:space="preserve">bject-hez vannak csatolva, </w:t>
+        <w:t>bject-hez</w:t>
+      </w:r>
+      <w:proofErr w:type="spellEnd"/>
+      <w:r>
+        <w:t xml:space="preserve"> vannak csatolva, </w:t>
       </w:r>
       <w:r>
         <w:t xml:space="preserve">a </w:t>
       </w:r>
+      <w:proofErr w:type="spellStart"/>
       <w:r>
         <w:t>MonoBehavio</w:t>
       </w:r>
@@ -1839,7 +2343,35 @@
         <w:t>u</w:t>
       </w:r>
       <w:r>
-        <w:t xml:space="preserve">r osztályból vannak származtatva. Ezek tartalmaznak Awake, Start, Update, és FixedUpdate függvényeket, amelyek Unity-ben előre meghatározott esetekben futnak le. </w:t>
+        <w:t>r</w:t>
+      </w:r>
+      <w:proofErr w:type="spellEnd"/>
+      <w:r>
+        <w:t xml:space="preserve"> osztályból vannak származtatva. Ezek tartalmaznak </w:t>
+      </w:r>
+      <w:proofErr w:type="spellStart"/>
+      <w:r>
+        <w:t>Awake</w:t>
+      </w:r>
+      <w:proofErr w:type="spellEnd"/>
+      <w:r>
+        <w:t xml:space="preserve">, Start, Update, és </w:t>
+      </w:r>
+      <w:proofErr w:type="spellStart"/>
+      <w:r>
+        <w:t>FixedUpdate</w:t>
+      </w:r>
+      <w:proofErr w:type="spellEnd"/>
+      <w:r>
+        <w:t xml:space="preserve"> függvényeket, amelyek </w:t>
+      </w:r>
+      <w:proofErr w:type="spellStart"/>
+      <w:r>
+        <w:t>Unity</w:t>
+      </w:r>
+      <w:proofErr w:type="spellEnd"/>
+      <w:r>
+        <w:t xml:space="preserve">-ben előre meghatározott esetekben futnak le. </w:t>
       </w:r>
       <w:r>
         <w:t>Bizonyos scriptek tartalmaznak OnTriggerEnter2D vagy OnTriggerExit2D függvényeket, ezek a pályán a különböző elemek érintésének érzékelésé</w:t>
@@ -1853,8 +2385,13 @@
       <w:r>
         <w:t xml:space="preserve"> </w:t>
       </w:r>
-      <w:r>
-        <w:t>Unity-be beépített függvények</w:t>
+      <w:proofErr w:type="spellStart"/>
+      <w:r>
+        <w:t>Unity</w:t>
+      </w:r>
+      <w:proofErr w:type="spellEnd"/>
+      <w:r>
+        <w:t>-be beépített függvények</w:t>
       </w:r>
       <w:r>
         <w:t xml:space="preserve"> közé tartozik</w:t>
@@ -1863,7 +2400,31 @@
         <w:t>.</w:t>
       </w:r>
       <w:r>
-        <w:t xml:space="preserve"> A nem MonoBehaviour osztályból származtatott osztályok, nem kapcsolódnak GameObject-ekhez, ezek custom típus</w:t>
+        <w:t xml:space="preserve"> A nem </w:t>
+      </w:r>
+      <w:proofErr w:type="spellStart"/>
+      <w:r>
+        <w:t>MonoBehaviour</w:t>
+      </w:r>
+      <w:proofErr w:type="spellEnd"/>
+      <w:r>
+        <w:t xml:space="preserve"> osztályból származtatott osztályok, nem kapcsolódnak </w:t>
+      </w:r>
+      <w:proofErr w:type="spellStart"/>
+      <w:r>
+        <w:t>GameObject-ekhez</w:t>
+      </w:r>
+      <w:proofErr w:type="spellEnd"/>
+      <w:r>
+        <w:t xml:space="preserve">, ezek </w:t>
+      </w:r>
+      <w:proofErr w:type="spellStart"/>
+      <w:r>
+        <w:t>custom</w:t>
+      </w:r>
+      <w:proofErr w:type="spellEnd"/>
+      <w:r>
+        <w:t xml:space="preserve"> típus</w:t>
       </w:r>
       <w:r>
         <w:t>t</w:t>
@@ -2103,7 +2664,15 @@
               <w:cnfStyle w:val="000000000000" w:firstRow="0" w:lastRow="0" w:firstColumn="0" w:lastColumn="0" w:oddVBand="0" w:evenVBand="0" w:oddHBand="0" w:evenHBand="0" w:firstRowFirstColumn="0" w:firstRowLastColumn="0" w:lastRowFirstColumn="0" w:lastRowLastColumn="0"/>
             </w:pPr>
             <w:r>
-              <w:t xml:space="preserve">Egy rács alapú térkép, amely csempékből (tile-okból) áll. </w:t>
+              <w:t>Egy rács alapú térkép, amely csempékből (</w:t>
+            </w:r>
+            <w:proofErr w:type="spellStart"/>
+            <w:r>
+              <w:t>tile</w:t>
+            </w:r>
+            <w:proofErr w:type="spellEnd"/>
+            <w:r>
+              <w:t xml:space="preserve">-okból) áll. </w:t>
             </w:r>
           </w:p>
         </w:tc>
@@ -2161,8 +2730,13 @@
             <w:pPr>
               <w:cnfStyle w:val="000000000000" w:firstRow="0" w:lastRow="0" w:firstColumn="0" w:lastColumn="0" w:oddVBand="0" w:evenVBand="0" w:oddHBand="0" w:evenHBand="0" w:firstRowFirstColumn="0" w:firstRowLastColumn="0" w:lastRowFirstColumn="0" w:lastRowLastColumn="0"/>
             </w:pPr>
-            <w:r>
-              <w:t>Unity-ben egy alapvető objektum, amely komponenseket tartalmaz és a játék világában helyezkedik el.</w:t>
+            <w:proofErr w:type="spellStart"/>
+            <w:r>
+              <w:t>Unity</w:t>
+            </w:r>
+            <w:proofErr w:type="spellEnd"/>
+            <w:r>
+              <w:t>-ben egy alapvető objektum, amely komponenseket tartalmaz és a játék világában helyezkedik el.</w:t>
             </w:r>
           </w:p>
         </w:tc>
@@ -2192,8 +2766,21 @@
             <w:pPr>
               <w:cnfStyle w:val="000000100000" w:firstRow="0" w:lastRow="0" w:firstColumn="0" w:lastColumn="0" w:oddVBand="0" w:evenVBand="0" w:oddHBand="1" w:evenHBand="0" w:firstRowFirstColumn="0" w:firstRowLastColumn="0" w:lastRowFirstColumn="0" w:lastRowLastColumn="0"/>
             </w:pPr>
-            <w:r>
-              <w:t>Unity-ben egy alap osztály, amelyből a scriptek származnak, hogy viselkedést adjanak a GamObject-ekhez.</w:t>
+            <w:proofErr w:type="spellStart"/>
+            <w:r>
+              <w:t>Unity</w:t>
+            </w:r>
+            <w:proofErr w:type="spellEnd"/>
+            <w:r>
+              <w:t xml:space="preserve">-ben egy alap osztály, amelyből a scriptek származnak, hogy viselkedést adjanak a </w:t>
+            </w:r>
+            <w:proofErr w:type="spellStart"/>
+            <w:r>
+              <w:t>GamObject-ekhez</w:t>
+            </w:r>
+            <w:proofErr w:type="spellEnd"/>
+            <w:r>
+              <w:t>.</w:t>
             </w:r>
           </w:p>
         </w:tc>
@@ -2265,7 +2852,11 @@
             <w:tcW w:w="4530" w:type="dxa"/>
             <w:vAlign w:val="center"/>
           </w:tcPr>
-          <w:p/>
+          <w:p>
+            <w:r>
+              <w:t>Unityhub</w:t>
+            </w:r>
+          </w:p>
         </w:tc>
         <w:tc>
           <w:tcPr>
@@ -2276,6 +2867,25 @@
             <w:pPr>
               <w:cnfStyle w:val="000000000000" w:firstRow="0" w:lastRow="0" w:firstColumn="0" w:lastColumn="0" w:oddVBand="0" w:evenVBand="0" w:oddHBand="0" w:evenHBand="0" w:firstRowFirstColumn="0" w:firstRowLastColumn="0" w:lastRowFirstColumn="0" w:lastRowLastColumn="0"/>
             </w:pPr>
+            <w:r>
+              <w:t xml:space="preserve">Egy önálló alkalmazás, amely segíti a </w:t>
+            </w:r>
+            <w:proofErr w:type="spellStart"/>
+            <w:r>
+              <w:t>Unity</w:t>
+            </w:r>
+            <w:proofErr w:type="spellEnd"/>
+            <w:r>
+              <w:t xml:space="preserve"> projektek és a </w:t>
+            </w:r>
+            <w:proofErr w:type="spellStart"/>
+            <w:r>
+              <w:t>Unity</w:t>
+            </w:r>
+            <w:proofErr w:type="spellEnd"/>
+            <w:r>
+              <w:t xml:space="preserve"> szerkesztői verziók telepítésének, kezelésének és rendszerezésének egyszerűsítését.</w:t>
+            </w:r>
           </w:p>
         </w:tc>
       </w:tr>
@@ -2289,7 +2899,11 @@
             <w:tcW w:w="4530" w:type="dxa"/>
             <w:vAlign w:val="center"/>
           </w:tcPr>
-          <w:p/>
+          <w:p>
+            <w:r>
+              <w:t>prefeb</w:t>
+            </w:r>
+          </w:p>
         </w:tc>
         <w:tc>
           <w:tcPr>
@@ -2300,6 +2914,22 @@
             <w:pPr>
               <w:cnfStyle w:val="000000100000" w:firstRow="0" w:lastRow="0" w:firstColumn="0" w:lastColumn="0" w:oddVBand="0" w:evenVBand="0" w:oddHBand="1" w:evenHBand="0" w:firstRowFirstColumn="0" w:firstRowLastColumn="0" w:lastRowFirstColumn="0" w:lastRowLastColumn="0"/>
             </w:pPr>
+            <w:proofErr w:type="spellStart"/>
+            <w:r>
+              <w:t>Unity</w:t>
+            </w:r>
+            <w:proofErr w:type="spellEnd"/>
+            <w:r>
+              <w:t xml:space="preserve">-ben egy előre elkészített, újrahasznosítható objektum sablon, amely lehetővé teszi </w:t>
+            </w:r>
+            <w:proofErr w:type="spellStart"/>
+            <w:r>
+              <w:t>GameObject</w:t>
+            </w:r>
+            <w:proofErr w:type="spellEnd"/>
+            <w:r>
+              <w:t>-ek és azok komponenseinek gyors és egységes létrehozását és módosítását.</w:t>
+            </w:r>
           </w:p>
         </w:tc>
       </w:tr>
@@ -2313,8 +2943,29 @@
         <w:t xml:space="preserve"> program két fő osztálya a</w:t>
       </w:r>
       <w:r>
-        <w:t xml:space="preserve"> MenuCotroller és a Game. Ezek látják el a fő műveleteket a program során. A MenuController osztály tartalmazza a menüben szereplő gombok funkciójának megvalósítását, a SceneLoader</w:t>
-      </w:r>
+        <w:t xml:space="preserve"> </w:t>
+      </w:r>
+      <w:proofErr w:type="spellStart"/>
+      <w:r>
+        <w:t>MenuCotroller</w:t>
+      </w:r>
+      <w:proofErr w:type="spellEnd"/>
+      <w:r>
+        <w:t xml:space="preserve"> és a Game. Ezek látják el a fő műveleteket a program során. A </w:t>
+      </w:r>
+      <w:proofErr w:type="spellStart"/>
+      <w:r>
+        <w:t>MenuController</w:t>
+      </w:r>
+      <w:proofErr w:type="spellEnd"/>
+      <w:r>
+        <w:t xml:space="preserve"> osztály tartalmazza a menüben szereplő gombok funkciójának megvalósítását, a </w:t>
+      </w:r>
+      <w:proofErr w:type="spellStart"/>
+      <w:r>
+        <w:t>SceneLoader</w:t>
+      </w:r>
+      <w:proofErr w:type="spellEnd"/>
       <w:r>
         <w:t xml:space="preserve"> osztály</w:t>
       </w:r>
@@ -2360,11 +3011,29 @@
       <w:r>
         <w:t xml:space="preserve"> „</w:t>
       </w:r>
-      <w:r>
-        <w:t>TileMapController” -nek</w:t>
-      </w:r>
-      <w:r>
-        <w:t xml:space="preserve"> neveztem el. Ebben megírt „LoadMap” függvényt hívja meg a Game egyik függvénye és ez tölti be fájlból az adatokat majd hívja meg</w:t>
+      <w:proofErr w:type="spellStart"/>
+      <w:r>
+        <w:t>TileMapController</w:t>
+      </w:r>
+      <w:proofErr w:type="spellEnd"/>
+      <w:r>
+        <w:t>” -</w:t>
+      </w:r>
+      <w:proofErr w:type="spellStart"/>
+      <w:r>
+        <w:t>nek</w:t>
+      </w:r>
+      <w:proofErr w:type="spellEnd"/>
+      <w:r>
+        <w:t xml:space="preserve"> neveztem el. Ebben megírt „</w:t>
+      </w:r>
+      <w:proofErr w:type="spellStart"/>
+      <w:r>
+        <w:t>LoadMap</w:t>
+      </w:r>
+      <w:proofErr w:type="spellEnd"/>
+      <w:r>
+        <w:t>” függvényt hívja meg a Game egyik függvénye és ez tölti be fájlból az adatokat majd hívja meg</w:t>
       </w:r>
       <w:r>
         <w:t xml:space="preserve"> a többi </w:t>
@@ -2373,13 +3042,37 @@
         <w:t>öt osztályt</w:t>
       </w:r>
       <w:r>
-        <w:t xml:space="preserve">. Ezek a tilemap különböző rétegeit betöltő és funkcióit megvalósító </w:t>
+        <w:t xml:space="preserve">. Ezek a </w:t>
+      </w:r>
+      <w:proofErr w:type="spellStart"/>
+      <w:r>
+        <w:t>tilemap</w:t>
+      </w:r>
+      <w:proofErr w:type="spellEnd"/>
+      <w:r>
+        <w:t xml:space="preserve"> különböző </w:t>
+      </w:r>
+      <w:proofErr w:type="spellStart"/>
+      <w:r>
+        <w:t>rétegeit</w:t>
+      </w:r>
+      <w:proofErr w:type="spellEnd"/>
+      <w:r>
+        <w:t xml:space="preserve"> betöltő és funkcióit megvalósító </w:t>
       </w:r>
       <w:r>
         <w:t>osztályok</w:t>
       </w:r>
       <w:r>
-        <w:t xml:space="preserve"> tartalmaznak egy statikus „instance” változót, aminek segítségével </w:t>
+        <w:t xml:space="preserve"> tartalmaznak egy statikus „</w:t>
+      </w:r>
+      <w:proofErr w:type="spellStart"/>
+      <w:r>
+        <w:t>instance</w:t>
+      </w:r>
+      <w:proofErr w:type="spellEnd"/>
+      <w:r>
+        <w:t xml:space="preserve">” változót, aminek segítségével </w:t>
       </w:r>
       <w:r>
         <w:t xml:space="preserve">lehet meghívni </w:t>
@@ -2391,7 +3084,15 @@
         <w:t>et</w:t>
       </w:r>
       <w:r>
-        <w:t xml:space="preserve">. A karakterek mozgását a karakterekhez hozzárendelt „PlayerMovement.cs” </w:t>
+        <w:t>. A karakterek mozgását a karakterekhez hozzárendelt „</w:t>
+      </w:r>
+      <w:proofErr w:type="spellStart"/>
+      <w:r>
+        <w:t>PlayerMovement.cs</w:t>
+      </w:r>
+      <w:proofErr w:type="spellEnd"/>
+      <w:r>
+        <w:t xml:space="preserve">” </w:t>
       </w:r>
       <w:r>
         <w:t>fájl</w:t>
@@ -2412,6 +3113,7 @@
         <w:t xml:space="preserve">tartalmaz hivatkozásokat a létező </w:t>
       </w:r>
       <w:r>
+        <w:lastRenderedPageBreak/>
         <w:t>karakterekhez</w:t>
       </w:r>
       <w:r>
@@ -2421,7 +3123,23 @@
         <w:t xml:space="preserve"> szükséges adatot</w:t>
       </w:r>
       <w:r>
-        <w:t>. A Game osztály egyszerre tartalmazza az egyjátékos és többjátékos mód megvalósítását is. A mód meghatározását egy boolen „Singleplayer” változó segíti a kód nagy</w:t>
+        <w:t xml:space="preserve">. A Game osztály egyszerre tartalmazza az egyjátékos és többjátékos mód megvalósítását is. A mód meghatározását egy </w:t>
+      </w:r>
+      <w:proofErr w:type="spellStart"/>
+      <w:r>
+        <w:t>boolen</w:t>
+      </w:r>
+      <w:proofErr w:type="spellEnd"/>
+      <w:r>
+        <w:t xml:space="preserve"> „</w:t>
+      </w:r>
+      <w:proofErr w:type="spellStart"/>
+      <w:r>
+        <w:t>Singleplayer</w:t>
+      </w:r>
+      <w:proofErr w:type="spellEnd"/>
+      <w:r>
+        <w:t>” változó segíti a kód nagy</w:t>
       </w:r>
       <w:r>
         <w:t xml:space="preserve"> </w:t>
@@ -2433,11 +3151,89 @@
         <w:t xml:space="preserve"> </w:t>
       </w:r>
       <w:r>
-        <w:t xml:space="preserve">Hivatkozást tartalmaz sok osztály ahhoz a GameObject-hez amelyhez a Game script van hozzárendelve. Ilyen osztályok a tilemap rétegeit betöltő osztályok, a MenuController és a StarController. Míg a tilemap-et betöltő és bizonyos funkcióit ellátó osztályok csak néhány függvényhívás, vagy változó használatának </w:t>
-      </w:r>
-      <w:r>
-        <w:lastRenderedPageBreak/>
-        <w:t>céljából tartalmazza a Game osztály hivatkozását, addig a MenuController valamivel többre. A program elindításakor a MenuControlleren keresztül töltődik be a beállítások fájlból, „Options.json” -ből, az elmentett beállítások</w:t>
+        <w:t xml:space="preserve">Hivatkozást tartalmaz sok osztály ahhoz a </w:t>
+      </w:r>
+      <w:proofErr w:type="spellStart"/>
+      <w:proofErr w:type="gramStart"/>
+      <w:r>
+        <w:t>GameObject-hez</w:t>
+      </w:r>
+      <w:proofErr w:type="spellEnd"/>
+      <w:proofErr w:type="gramEnd"/>
+      <w:r>
+        <w:t xml:space="preserve"> amelyhez a Game script van hozzárendelve. Ilyen osztályok a </w:t>
+      </w:r>
+      <w:proofErr w:type="spellStart"/>
+      <w:r>
+        <w:t>tilemap</w:t>
+      </w:r>
+      <w:proofErr w:type="spellEnd"/>
+      <w:r>
+        <w:t xml:space="preserve"> </w:t>
+      </w:r>
+      <w:proofErr w:type="spellStart"/>
+      <w:r>
+        <w:t>rétegeit</w:t>
+      </w:r>
+      <w:proofErr w:type="spellEnd"/>
+      <w:r>
+        <w:t xml:space="preserve"> betöltő osztályok, a </w:t>
+      </w:r>
+      <w:proofErr w:type="spellStart"/>
+      <w:r>
+        <w:t>MenuController</w:t>
+      </w:r>
+      <w:proofErr w:type="spellEnd"/>
+      <w:r>
+        <w:t xml:space="preserve"> és a </w:t>
+      </w:r>
+      <w:proofErr w:type="spellStart"/>
+      <w:r>
+        <w:t>StarController</w:t>
+      </w:r>
+      <w:proofErr w:type="spellEnd"/>
+      <w:r>
+        <w:t xml:space="preserve">. Míg a </w:t>
+      </w:r>
+      <w:proofErr w:type="spellStart"/>
+      <w:r>
+        <w:t>tilemap-et</w:t>
+      </w:r>
+      <w:proofErr w:type="spellEnd"/>
+      <w:r>
+        <w:t xml:space="preserve"> betöltő és bizonyos funkcióit ellátó osztályok csak néhány függvényhívás, vagy változó használatának céljából tartalmazza a Game osztály hivatkozását, addig a </w:t>
+      </w:r>
+      <w:proofErr w:type="spellStart"/>
+      <w:r>
+        <w:t>MenuController</w:t>
+      </w:r>
+      <w:proofErr w:type="spellEnd"/>
+      <w:r>
+        <w:t xml:space="preserve"> valamivel többre. A program elindításakor a </w:t>
+      </w:r>
+      <w:proofErr w:type="spellStart"/>
+      <w:r>
+        <w:t>MenuControlleren</w:t>
+      </w:r>
+      <w:proofErr w:type="spellEnd"/>
+      <w:r>
+        <w:t xml:space="preserve"> keresztül töltődik be a beállítások fájlból, „</w:t>
+      </w:r>
+      <w:proofErr w:type="spellStart"/>
+      <w:r>
+        <w:t>Options.json</w:t>
+      </w:r>
+      <w:proofErr w:type="spellEnd"/>
+      <w:r>
+        <w:t>” -</w:t>
+      </w:r>
+      <w:proofErr w:type="spellStart"/>
+      <w:r>
+        <w:t>ből</w:t>
+      </w:r>
+      <w:proofErr w:type="spellEnd"/>
+      <w:r>
+        <w:t>, az elmentett beállítások</w:t>
       </w:r>
       <w:r>
         <w:t>,</w:t>
@@ -2446,15 +3242,772 @@
         <w:t xml:space="preserve"> a Game osztály változóiba.</w:t>
       </w:r>
       <w:r>
-        <w:t xml:space="preserve"> A betöltést és a mentést egy statikus osztály hajtja végre, ez a „Saver.cs” nevű fájlban lett megírva.</w:t>
+        <w:t xml:space="preserve"> A betöltést és a mentést egy statikus osztály hajtja végre, ez a „</w:t>
+      </w:r>
+      <w:proofErr w:type="spellStart"/>
+      <w:r>
+        <w:t>Saver.cs</w:t>
+      </w:r>
+      <w:proofErr w:type="spellEnd"/>
+      <w:r>
+        <w:t>” nevű fájlban lett megírva.</w:t>
       </w:r>
     </w:p>
     <w:p>
       <w:r>
-        <w:t xml:space="preserve">Néhány fájl nem csak az osztály definícióját tartalmazza, hanem olyan custom típusokat is, amelyek segítik a json fájlok írását és olvasását. Ilyen típusok szerepelnek a Saver osztály mellett, a StarController mellett, illetve a TileMapController mellett is. Ezekhez az összetett típusokhoz nem láttam szükségét külön fájlt létrehozni, így oda raktam őket, ahol használatuk alapján logikusnak éreztem. A „StarController.cs” tartalmazza a StarCollection osztályt, ami segíti a gyűjtött csillagok kezelését, illetve mentését. A Saver osztály mellett találtahó egy OptionSave struct szerkezet, amely az alapbeállítások és a csillagok adatait tárolja mentés céljából. </w:t>
-      </w:r>
-      <w:r>
-        <w:t>A „TileMapController.cs” több saját osztályt tartalmaz, ezek közül a LevelData osztály adja a pályákat tároló fájlok szerkezetét. Ennek az osztálynak a változóiba töltődik be a json fájlban pálya adatok. Tartalmazza listában a karakterek, csillagok és az összes tilemap réteg elemeinek pozícióját, emellett a betöltendő tile-ok neveit is. Két speciális szerkezetben van tárolva a betöltendő gombok és kapuk adatai. A gomboknál listában tárolva van mely kapukat aktiválják, a kapuknál pedig, hogy milyen szögben vannak elforgatva.</w:t>
+        <w:rPr>
+          <w:noProof/>
+        </w:rPr>
+        <mc:AlternateContent>
+          <mc:Choice Requires="wps">
+            <w:drawing>
+              <wp:anchor distT="0" distB="0" distL="114300" distR="114300" simplePos="0" relativeHeight="251670528" behindDoc="1" locked="0" layoutInCell="1" allowOverlap="1" wp14:anchorId="5327133D" wp14:editId="3CAF0A76">
+                <wp:simplePos x="0" y="0"/>
+                <wp:positionH relativeFrom="column">
+                  <wp:posOffset>4324350</wp:posOffset>
+                </wp:positionH>
+                <wp:positionV relativeFrom="paragraph">
+                  <wp:posOffset>5251450</wp:posOffset>
+                </wp:positionV>
+                <wp:extent cx="1435100" cy="635"/>
+                <wp:effectExtent l="0" t="0" r="0" b="0"/>
+                <wp:wrapTight wrapText="bothSides">
+                  <wp:wrapPolygon edited="0">
+                    <wp:start x="0" y="0"/>
+                    <wp:lineTo x="0" y="21600"/>
+                    <wp:lineTo x="21600" y="21600"/>
+                    <wp:lineTo x="21600" y="0"/>
+                  </wp:wrapPolygon>
+                </wp:wrapTight>
+                <wp:docPr id="980354071" name="Szövegdoboz 1"/>
+                <wp:cNvGraphicFramePr/>
+                <a:graphic xmlns:a="http://schemas.openxmlformats.org/drawingml/2006/main">
+                  <a:graphicData uri="http://schemas.microsoft.com/office/word/2010/wordprocessingShape">
+                    <wps:wsp>
+                      <wps:cNvSpPr txBox="1"/>
+                      <wps:spPr>
+                        <a:xfrm>
+                          <a:off x="0" y="0"/>
+                          <a:ext cx="1435100" cy="635"/>
+                        </a:xfrm>
+                        <a:prstGeom prst="rect">
+                          <a:avLst/>
+                        </a:prstGeom>
+                        <a:solidFill>
+                          <a:prstClr val="white"/>
+                        </a:solidFill>
+                        <a:ln>
+                          <a:noFill/>
+                        </a:ln>
+                      </wps:spPr>
+                      <wps:txbx>
+                        <w:txbxContent>
+                          <w:p>
+                            <w:pPr>
+                              <w:pStyle w:val="Kpalrs"/>
+                              <w:rPr>
+                                <w:szCs w:val="22"/>
+                              </w:rPr>
+                            </w:pPr>
+                            <w:fldSimple w:instr=" SEQ ábra \* ARABIC ">
+                              <w:r>
+                                <w:rPr>
+                                  <w:noProof/>
+                                </w:rPr>
+                                <w:t>4</w:t>
+                              </w:r>
+                            </w:fldSimple>
+                            <w:r>
+                              <w:t>. ábra</w:t>
+                            </w:r>
+                            <w:r>
+                              <w:t xml:space="preserve"> </w:t>
+                            </w:r>
+                            <w:proofErr w:type="spellStart"/>
+                            <w:r>
+                              <w:t>Assets</w:t>
+                            </w:r>
+                            <w:proofErr w:type="spellEnd"/>
+                            <w:r>
+                              <w:t xml:space="preserve"> mappa szerkezete</w:t>
+                            </w:r>
+                          </w:p>
+                        </w:txbxContent>
+                      </wps:txbx>
+                      <wps:bodyPr rot="0" spcFirstLastPara="0" vertOverflow="overflow" horzOverflow="overflow" vert="horz" wrap="square" lIns="0" tIns="0" rIns="0" bIns="0" numCol="1" spcCol="0" rtlCol="0" fromWordArt="0" anchor="t" anchorCtr="0" forceAA="0" compatLnSpc="1">
+                        <a:prstTxWarp prst="textNoShape">
+                          <a:avLst/>
+                        </a:prstTxWarp>
+                        <a:spAutoFit/>
+                      </wps:bodyPr>
+                    </wps:wsp>
+                  </a:graphicData>
+                </a:graphic>
+              </wp:anchor>
+            </w:drawing>
+          </mc:Choice>
+          <mc:Fallback>
+            <w:pict>
+              <v:shape w14:anchorId="5327133D" id="_x0000_s1029" type="#_x0000_t202" style="position:absolute;left:0;text-align:left;margin-left:340.5pt;margin-top:413.5pt;width:113pt;height:.05pt;z-index:-251645952;visibility:visible;mso-wrap-style:square;mso-wrap-distance-left:9pt;mso-wrap-distance-top:0;mso-wrap-distance-right:9pt;mso-wrap-distance-bottom:0;mso-position-horizontal:absolute;mso-position-horizontal-relative:text;mso-position-vertical:absolute;mso-position-vertical-relative:text;v-text-anchor:top" o:gfxdata="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" stroked="f">
+                <v:textbox style="mso-fit-shape-to-text:t" inset="0,0,0,0">
+                  <w:txbxContent>
+                    <w:p>
+                      <w:pPr>
+                        <w:pStyle w:val="Kpalrs"/>
+                        <w:rPr>
+                          <w:szCs w:val="22"/>
+                        </w:rPr>
+                      </w:pPr>
+                      <w:fldSimple w:instr=" SEQ ábra \* ARABIC ">
+                        <w:r>
+                          <w:rPr>
+                            <w:noProof/>
+                          </w:rPr>
+                          <w:t>4</w:t>
+                        </w:r>
+                      </w:fldSimple>
+                      <w:r>
+                        <w:t>. ábra</w:t>
+                      </w:r>
+                      <w:r>
+                        <w:t xml:space="preserve"> </w:t>
+                      </w:r>
+                      <w:proofErr w:type="spellStart"/>
+                      <w:r>
+                        <w:t>Assets</w:t>
+                      </w:r>
+                      <w:proofErr w:type="spellEnd"/>
+                      <w:r>
+                        <w:t xml:space="preserve"> mappa szerkezete</w:t>
+                      </w:r>
+                    </w:p>
+                  </w:txbxContent>
+                </v:textbox>
+                <w10:wrap type="tight"/>
+              </v:shape>
+            </w:pict>
+          </mc:Fallback>
+        </mc:AlternateContent>
+      </w:r>
+      <w:r>
+        <w:drawing>
+          <wp:anchor distT="0" distB="0" distL="114300" distR="114300" simplePos="0" relativeHeight="251668480" behindDoc="1" locked="0" layoutInCell="1" allowOverlap="1" wp14:anchorId="5AA0DCCA" wp14:editId="1051A14C">
+            <wp:simplePos x="0" y="0"/>
+            <wp:positionH relativeFrom="margin">
+              <wp:posOffset>4324350</wp:posOffset>
+            </wp:positionH>
+            <wp:positionV relativeFrom="paragraph">
+              <wp:posOffset>2525257</wp:posOffset>
+            </wp:positionV>
+            <wp:extent cx="1435100" cy="2669540"/>
+            <wp:effectExtent l="0" t="0" r="0" b="0"/>
+            <wp:wrapTight wrapText="bothSides">
+              <wp:wrapPolygon edited="0">
+                <wp:start x="0" y="0"/>
+                <wp:lineTo x="0" y="21425"/>
+                <wp:lineTo x="21218" y="21425"/>
+                <wp:lineTo x="21218" y="0"/>
+                <wp:lineTo x="0" y="0"/>
+              </wp:wrapPolygon>
+            </wp:wrapTight>
+            <wp:docPr id="1564505984" name="Kép 1"/>
+            <wp:cNvGraphicFramePr>
+              <a:graphicFrameLocks xmlns:a="http://schemas.openxmlformats.org/drawingml/2006/main" noChangeAspect="1"/>
+            </wp:cNvGraphicFramePr>
+            <a:graphic xmlns:a="http://schemas.openxmlformats.org/drawingml/2006/main">
+              <a:graphicData uri="http://schemas.openxmlformats.org/drawingml/2006/picture">
+                <pic:pic xmlns:pic="http://schemas.openxmlformats.org/drawingml/2006/picture">
+                  <pic:nvPicPr>
+                    <pic:cNvPr id="1564505984" name=""/>
+                    <pic:cNvPicPr/>
+                  </pic:nvPicPr>
+                  <pic:blipFill>
+                    <a:blip r:embed="rId16">
+                      <a:extLst>
+                        <a:ext uri="{28A0092B-C50C-407E-A947-70E740481C1C}">
+                          <a14:useLocalDpi xmlns:a14="http://schemas.microsoft.com/office/drawing/2010/main" val="0"/>
+                        </a:ext>
+                      </a:extLst>
+                    </a:blip>
+                    <a:stretch>
+                      <a:fillRect/>
+                    </a:stretch>
+                  </pic:blipFill>
+                  <pic:spPr>
+                    <a:xfrm>
+                      <a:off x="0" y="0"/>
+                      <a:ext cx="1435100" cy="2669540"/>
+                    </a:xfrm>
+                    <a:prstGeom prst="rect">
+                      <a:avLst/>
+                    </a:prstGeom>
+                  </pic:spPr>
+                </pic:pic>
+              </a:graphicData>
+            </a:graphic>
+            <wp14:sizeRelH relativeFrom="margin">
+              <wp14:pctWidth>0</wp14:pctWidth>
+            </wp14:sizeRelH>
+            <wp14:sizeRelV relativeFrom="margin">
+              <wp14:pctHeight>0</wp14:pctHeight>
+            </wp14:sizeRelV>
+          </wp:anchor>
+        </w:drawing>
+      </w:r>
+      <w:r>
+        <w:t xml:space="preserve">Néhány fájl nem csak az osztály definícióját tartalmazza, hanem olyan </w:t>
+      </w:r>
+      <w:proofErr w:type="spellStart"/>
+      <w:r>
+        <w:t>custom</w:t>
+      </w:r>
+      <w:proofErr w:type="spellEnd"/>
+      <w:r>
+        <w:t xml:space="preserve"> típusokat is, amelyek segítik a </w:t>
+      </w:r>
+      <w:proofErr w:type="spellStart"/>
+      <w:r>
+        <w:t>json</w:t>
+      </w:r>
+      <w:proofErr w:type="spellEnd"/>
+      <w:r>
+        <w:t xml:space="preserve"> fájlok írását és olvasását. Ilyen típusok szerepelnek a </w:t>
+      </w:r>
+      <w:proofErr w:type="spellStart"/>
+      <w:r>
+        <w:t>Saver</w:t>
+      </w:r>
+      <w:proofErr w:type="spellEnd"/>
+      <w:r>
+        <w:t xml:space="preserve"> osztály mellett, a </w:t>
+      </w:r>
+      <w:proofErr w:type="spellStart"/>
+      <w:r>
+        <w:t>StarController</w:t>
+      </w:r>
+      <w:proofErr w:type="spellEnd"/>
+      <w:r>
+        <w:t xml:space="preserve"> mellett, illetve a </w:t>
+      </w:r>
+      <w:proofErr w:type="spellStart"/>
+      <w:r>
+        <w:t>TileMapController</w:t>
+      </w:r>
+      <w:proofErr w:type="spellEnd"/>
+      <w:r>
+        <w:t xml:space="preserve"> mellett is. Ezekhez az összetett típusokhoz nem láttam szükségét külön fájlt létrehozni, így oda raktam őket, ahol használatuk alapján logikusnak éreztem. A „</w:t>
+      </w:r>
+      <w:proofErr w:type="spellStart"/>
+      <w:r>
+        <w:t>StarController.cs</w:t>
+      </w:r>
+      <w:proofErr w:type="spellEnd"/>
+      <w:r>
+        <w:t xml:space="preserve">” tartalmazza a </w:t>
+      </w:r>
+      <w:proofErr w:type="spellStart"/>
+      <w:r>
+        <w:t>StarCollection</w:t>
+      </w:r>
+      <w:proofErr w:type="spellEnd"/>
+      <w:r>
+        <w:t xml:space="preserve"> osztályt, ami segíti a gyűjtött csillagok kezelését, illetve mentését. A </w:t>
+      </w:r>
+      <w:proofErr w:type="spellStart"/>
+      <w:r>
+        <w:t>Saver</w:t>
+      </w:r>
+      <w:proofErr w:type="spellEnd"/>
+      <w:r>
+        <w:t xml:space="preserve"> osztály mellett </w:t>
+      </w:r>
+      <w:proofErr w:type="spellStart"/>
+      <w:r>
+        <w:t>találtahó</w:t>
+      </w:r>
+      <w:proofErr w:type="spellEnd"/>
+      <w:r>
+        <w:t xml:space="preserve"> egy </w:t>
+      </w:r>
+      <w:proofErr w:type="spellStart"/>
+      <w:r>
+        <w:t>OptionSave</w:t>
+      </w:r>
+      <w:proofErr w:type="spellEnd"/>
+      <w:r>
+        <w:t xml:space="preserve"> </w:t>
+      </w:r>
+      <w:proofErr w:type="spellStart"/>
+      <w:r>
+        <w:t>struct</w:t>
+      </w:r>
+      <w:proofErr w:type="spellEnd"/>
+      <w:r>
+        <w:t xml:space="preserve"> szerkezet, amely az alapbeállítások és a csillagok adatait tárolja mentés céljából. </w:t>
+      </w:r>
+      <w:r>
+        <w:t>A „</w:t>
+      </w:r>
+      <w:proofErr w:type="spellStart"/>
+      <w:r>
+        <w:t>TileMapController.cs</w:t>
+      </w:r>
+      <w:proofErr w:type="spellEnd"/>
+      <w:r>
+        <w:t xml:space="preserve">” több saját osztályt tartalmaz, ezek közül a </w:t>
+      </w:r>
+      <w:proofErr w:type="spellStart"/>
+      <w:r>
+        <w:t>LevelData</w:t>
+      </w:r>
+      <w:proofErr w:type="spellEnd"/>
+      <w:r>
+        <w:t xml:space="preserve"> osztály adja a pályákat tároló fájlok szerkezetét. Ennek az osztálynak a változóiba töltődik be a </w:t>
+      </w:r>
+      <w:proofErr w:type="spellStart"/>
+      <w:r>
+        <w:t>json</w:t>
+      </w:r>
+      <w:proofErr w:type="spellEnd"/>
+      <w:r>
+        <w:t xml:space="preserve"> fájlban pálya adatok. Tartalmazza listában a karakterek, csillagok és az összes </w:t>
+      </w:r>
+      <w:proofErr w:type="spellStart"/>
+      <w:r>
+        <w:t>tilemap</w:t>
+      </w:r>
+      <w:proofErr w:type="spellEnd"/>
+      <w:r>
+        <w:t xml:space="preserve"> réteg elemeinek pozícióját, emellett a betöltendő </w:t>
+      </w:r>
+      <w:proofErr w:type="spellStart"/>
+      <w:r>
+        <w:t>tile</w:t>
+      </w:r>
+      <w:proofErr w:type="spellEnd"/>
+      <w:r>
+        <w:t>-ok neveit is. Két speciális szerkezetben van tárolva a betöltendő gombok és kapuk adatai. A gomboknál listában tárolva van mely kapukat aktiválják, a kapuknál pedig, hogy milyen szögben vannak elforgatva.</w:t>
+      </w:r>
+      <w:r>
+        <w:rPr>
+          <w:noProof/>
+        </w:rPr>
+        <w:t xml:space="preserve"> </w:t>
+      </w:r>
+    </w:p>
+    <w:p>
+      <w:proofErr w:type="spellStart"/>
+      <w:r>
+        <w:t>Unity</w:t>
+      </w:r>
+      <w:proofErr w:type="spellEnd"/>
+      <w:r>
+        <w:t xml:space="preserve"> projekt a </w:t>
+      </w:r>
+      <w:proofErr w:type="spellStart"/>
+      <w:r>
+        <w:t>UnityHub</w:t>
+      </w:r>
+      <w:proofErr w:type="spellEnd"/>
+      <w:r>
+        <w:t xml:space="preserve"> program segítségével lett generálva. A </w:t>
+      </w:r>
+      <w:proofErr w:type="spellStart"/>
+      <w:r>
+        <w:t>build</w:t>
+      </w:r>
+      <w:proofErr w:type="spellEnd"/>
+      <w:r>
+        <w:t xml:space="preserve"> előtti állapotban az </w:t>
+      </w:r>
+      <w:proofErr w:type="spellStart"/>
+      <w:r>
+        <w:t>Assets</w:t>
+      </w:r>
+      <w:proofErr w:type="spellEnd"/>
+      <w:r>
+        <w:t xml:space="preserve"> mappa tartalmaz minden általam készített fájlt a programhoz. A </w:t>
+      </w:r>
+      <w:proofErr w:type="spellStart"/>
+      <w:r>
+        <w:t>Custom</w:t>
+      </w:r>
+      <w:proofErr w:type="spellEnd"/>
+      <w:r>
+        <w:t xml:space="preserve"> </w:t>
+      </w:r>
+      <w:proofErr w:type="spellStart"/>
+      <w:r>
+        <w:t>Tiles</w:t>
+      </w:r>
+      <w:proofErr w:type="spellEnd"/>
+      <w:r>
+        <w:t xml:space="preserve"> mappa tartalmazza a korábban már megemlített </w:t>
+      </w:r>
+      <w:proofErr w:type="spellStart"/>
+      <w:r>
+        <w:t>Custom</w:t>
+      </w:r>
+      <w:proofErr w:type="spellEnd"/>
+      <w:r>
+        <w:t xml:space="preserve"> </w:t>
+      </w:r>
+      <w:proofErr w:type="spellStart"/>
+      <w:r>
+        <w:t>Tile</w:t>
+      </w:r>
+      <w:proofErr w:type="spellEnd"/>
+      <w:r>
+        <w:t xml:space="preserve"> saját típusból készült objektumokat, amelyek különböző scriptekhez vannak csatolva. A </w:t>
+      </w:r>
+      <w:proofErr w:type="spellStart"/>
+      <w:r>
+        <w:lastRenderedPageBreak/>
+        <w:t>Prefebs</w:t>
+      </w:r>
+      <w:proofErr w:type="spellEnd"/>
+      <w:r>
+        <w:t xml:space="preserve"> mappa tartalmazza az olyan </w:t>
+      </w:r>
+      <w:proofErr w:type="spellStart"/>
+      <w:r>
+        <w:t>Unitys</w:t>
+      </w:r>
+      <w:proofErr w:type="spellEnd"/>
+      <w:r>
+        <w:t xml:space="preserve"> </w:t>
+      </w:r>
+      <w:proofErr w:type="spellStart"/>
+      <w:proofErr w:type="gramStart"/>
+      <w:r>
+        <w:t>gameobjekt-eket</w:t>
+      </w:r>
+      <w:proofErr w:type="spellEnd"/>
+      <w:proofErr w:type="gramEnd"/>
+      <w:r>
+        <w:t xml:space="preserve"> amelyek bizonyos komponensekkel, scriptekkel vannak ellátva, akár előre beállított értékekkel. Ezeket a </w:t>
+      </w:r>
+      <w:proofErr w:type="spellStart"/>
+      <w:r>
+        <w:t>prefeb-eket</w:t>
+      </w:r>
+      <w:proofErr w:type="spellEnd"/>
+      <w:r>
+        <w:t xml:space="preserve"> hozzáadva scriptekhez, létrehozható másolat ezekről a </w:t>
+      </w:r>
+      <w:proofErr w:type="spellStart"/>
+      <w:r>
+        <w:t>gamobject-ekről</w:t>
+      </w:r>
+      <w:proofErr w:type="spellEnd"/>
+      <w:r>
+        <w:t xml:space="preserve"> kódból, hogy új elemek legyenek hozzáadva a program felületéhez futás közben.</w:t>
+      </w:r>
+      <w:r>
+        <w:t xml:space="preserve"> Ilyen </w:t>
+      </w:r>
+      <w:proofErr w:type="spellStart"/>
+      <w:r>
+        <w:t>prefeb</w:t>
+      </w:r>
+      <w:proofErr w:type="spellEnd"/>
+      <w:r>
+        <w:t xml:space="preserve">-ek a karakterekhez, a különböző színű kapukhoz és a csillaghoz vannak elkészítve. Mellettük található egy </w:t>
+      </w:r>
+      <w:proofErr w:type="spellStart"/>
+      <w:r>
+        <w:t>Animations</w:t>
+      </w:r>
+      <w:proofErr w:type="spellEnd"/>
+      <w:r>
+        <w:t xml:space="preserve"> mappa is</w:t>
+      </w:r>
+      <w:r>
+        <w:t>,</w:t>
+      </w:r>
+      <w:r>
+        <w:t xml:space="preserve"> ami a kapukhoz</w:t>
+      </w:r>
+      <w:r>
+        <w:t>,</w:t>
+      </w:r>
+      <w:r>
+        <w:t xml:space="preserve"> illetve a csillaghoz tartozó animációkat leíró fájlokat tartalmazza.</w:t>
+      </w:r>
+      <w:r>
+        <w:t xml:space="preserve"> A </w:t>
+      </w:r>
+      <w:proofErr w:type="spellStart"/>
+      <w:r>
+        <w:t>Scenes</w:t>
+      </w:r>
+      <w:proofErr w:type="spellEnd"/>
+      <w:r>
+        <w:t xml:space="preserve"> mappa tárolja a három jelenetet, amit a program használ. Külön van a menü és a két játékmód</w:t>
+      </w:r>
+      <w:r>
+        <w:t xml:space="preserve">. A </w:t>
+      </w:r>
+      <w:proofErr w:type="spellStart"/>
+      <w:r>
+        <w:t>Sprites</w:t>
+      </w:r>
+      <w:proofErr w:type="spellEnd"/>
+      <w:r>
+        <w:t xml:space="preserve"> mappa tartalmazza a képeket, ábrákat, amiket használtam a program készítéséhez. Ezek többségét én készítettem a programhoz. A </w:t>
+      </w:r>
+      <w:proofErr w:type="spellStart"/>
+      <w:r>
+        <w:t>StreamingAssets</w:t>
+      </w:r>
+      <w:proofErr w:type="spellEnd"/>
+      <w:r>
+        <w:t xml:space="preserve"> mappa speciális tulajdonsággal bír </w:t>
+      </w:r>
+      <w:proofErr w:type="gramStart"/>
+      <w:r>
+        <w:t>a</w:t>
+      </w:r>
+      <w:proofErr w:type="gramEnd"/>
+      <w:r>
+        <w:t xml:space="preserve"> </w:t>
+      </w:r>
+      <w:proofErr w:type="spellStart"/>
+      <w:r>
+        <w:t>unityben</w:t>
+      </w:r>
+      <w:proofErr w:type="spellEnd"/>
+      <w:r>
+        <w:t xml:space="preserve">, ugyanis tartalma </w:t>
+      </w:r>
+      <w:proofErr w:type="spellStart"/>
+      <w:r>
+        <w:t>build-eléskor</w:t>
+      </w:r>
+      <w:proofErr w:type="spellEnd"/>
+      <w:r>
+        <w:t xml:space="preserve"> átkerül a </w:t>
+      </w:r>
+      <w:proofErr w:type="spellStart"/>
+      <w:r>
+        <w:t>build</w:t>
+      </w:r>
+      <w:proofErr w:type="spellEnd"/>
+      <w:r>
+        <w:t xml:space="preserve"> adatai közé. Ebbe készítettem és itt tárolom a pályák </w:t>
+      </w:r>
+      <w:proofErr w:type="spellStart"/>
+      <w:r>
+        <w:t>json</w:t>
+      </w:r>
+      <w:proofErr w:type="spellEnd"/>
+      <w:r>
+        <w:t xml:space="preserve"> fájljait egy </w:t>
+      </w:r>
+      <w:proofErr w:type="spellStart"/>
+      <w:r>
+        <w:t>Maps</w:t>
+      </w:r>
+      <w:proofErr w:type="spellEnd"/>
+      <w:r>
+        <w:t xml:space="preserve"> almappában. A </w:t>
+      </w:r>
+      <w:proofErr w:type="spellStart"/>
+      <w:r>
+        <w:t>TileMapAssets</w:t>
+      </w:r>
+      <w:proofErr w:type="spellEnd"/>
+      <w:r>
+        <w:t xml:space="preserve"> tartalmazza a </w:t>
+      </w:r>
+      <w:proofErr w:type="spellStart"/>
+      <w:r>
+        <w:t>tilemap</w:t>
+      </w:r>
+      <w:proofErr w:type="spellEnd"/>
+      <w:r>
+        <w:t xml:space="preserve"> készítéséhez használt paletta megfogalmazását és bizonyos elemit. Végül a </w:t>
+      </w:r>
+      <w:proofErr w:type="spellStart"/>
+      <w:r>
+        <w:t>Scripts</w:t>
+      </w:r>
+      <w:proofErr w:type="spellEnd"/>
+      <w:r>
+        <w:t xml:space="preserve"> mappa tartalmazza a .</w:t>
+      </w:r>
+      <w:proofErr w:type="spellStart"/>
+      <w:r>
+        <w:t>cs</w:t>
+      </w:r>
+      <w:proofErr w:type="spellEnd"/>
+      <w:r>
+        <w:t xml:space="preserve"> fájlokat, amelyek a program működésének alapjai.</w:t>
+      </w:r>
+    </w:p>
+    <w:p>
+      <w:r>
+        <w:t xml:space="preserve">A </w:t>
+      </w:r>
+      <w:proofErr w:type="spellStart"/>
+      <w:r>
+        <w:t>UnityHubon</w:t>
+      </w:r>
+      <w:proofErr w:type="spellEnd"/>
+      <w:r>
+        <w:t xml:space="preserve"> keresztül megnyitva a projektet lehet </w:t>
+      </w:r>
+      <w:proofErr w:type="spellStart"/>
+      <w:r>
+        <w:t>buildelni</w:t>
+      </w:r>
+      <w:proofErr w:type="spellEnd"/>
+      <w:r>
+        <w:t xml:space="preserve"> azt. Ezt már elvégeztem</w:t>
+      </w:r>
+      <w:r>
+        <w:t>,</w:t>
+      </w:r>
+      <w:r>
+        <w:t xml:space="preserve"> így jött létre a </w:t>
+      </w:r>
+      <w:proofErr w:type="spellStart"/>
+      <w:r>
+        <w:t>Build</w:t>
+      </w:r>
+      <w:proofErr w:type="spellEnd"/>
+      <w:r>
+        <w:t xml:space="preserve"> mappa tartalma. </w:t>
+      </w:r>
+      <w:r>
+        <w:t xml:space="preserve">Felbontással és ablakmóddal kapcsolatos beállítások miatt csak Windows rendszeren fut a program. A </w:t>
+      </w:r>
+      <w:proofErr w:type="spellStart"/>
+      <w:r>
+        <w:t>buildelés</w:t>
+      </w:r>
+      <w:proofErr w:type="spellEnd"/>
+      <w:r>
+        <w:t xml:space="preserve"> egyébként a projekt megnyitása után a File </w:t>
+      </w:r>
+      <w:r>
+        <w:t>&gt;</w:t>
+      </w:r>
+      <w:r>
+        <w:t xml:space="preserve"> </w:t>
+      </w:r>
+      <w:proofErr w:type="spellStart"/>
+      <w:r>
+        <w:t>Build</w:t>
+      </w:r>
+      <w:proofErr w:type="spellEnd"/>
+      <w:r>
+        <w:t xml:space="preserve"> and </w:t>
+      </w:r>
+      <w:proofErr w:type="spellStart"/>
+      <w:r>
+        <w:t>Run</w:t>
+      </w:r>
+      <w:proofErr w:type="spellEnd"/>
+      <w:r>
+        <w:t xml:space="preserve"> opcióval vagy a </w:t>
+      </w:r>
+      <w:proofErr w:type="spellStart"/>
+      <w:r>
+        <w:t>Build</w:t>
+      </w:r>
+      <w:proofErr w:type="spellEnd"/>
+      <w:r>
+        <w:t xml:space="preserve"> </w:t>
+      </w:r>
+      <w:proofErr w:type="spellStart"/>
+      <w:r>
+        <w:t>Settings</w:t>
+      </w:r>
+      <w:proofErr w:type="spellEnd"/>
+      <w:r>
+        <w:t xml:space="preserve">… -en belül a </w:t>
+      </w:r>
+      <w:proofErr w:type="spellStart"/>
+      <w:r>
+        <w:t>Build</w:t>
+      </w:r>
+      <w:proofErr w:type="spellEnd"/>
+      <w:r>
+        <w:t xml:space="preserve"> vagy </w:t>
+      </w:r>
+      <w:proofErr w:type="spellStart"/>
+      <w:r>
+        <w:t>Build</w:t>
+      </w:r>
+      <w:proofErr w:type="spellEnd"/>
+      <w:r>
+        <w:t xml:space="preserve"> and </w:t>
+      </w:r>
+      <w:proofErr w:type="spellStart"/>
+      <w:r>
+        <w:t>Run</w:t>
+      </w:r>
+      <w:proofErr w:type="spellEnd"/>
+      <w:r>
+        <w:t xml:space="preserve"> gombbal hajtható végre.</w:t>
+      </w:r>
+      <w:r>
+        <w:t xml:space="preserve"> A program futtatásához a </w:t>
+      </w:r>
+      <w:proofErr w:type="spellStart"/>
+      <w:r>
+        <w:t>Build</w:t>
+      </w:r>
+      <w:proofErr w:type="spellEnd"/>
+      <w:r>
+        <w:t xml:space="preserve"> mappa tartalmán kívül másra nincs szükség a működés szempontjából.</w:t>
+      </w:r>
+    </w:p>
+    <w:p>
+      <w:r>
+        <w:t xml:space="preserve">A program kódjának bizonyos részeinek tesztelésére </w:t>
+      </w:r>
+      <w:r>
+        <w:t xml:space="preserve">a </w:t>
+      </w:r>
+      <w:proofErr w:type="spellStart"/>
+      <w:r>
+        <w:t>Unityben</w:t>
+      </w:r>
+      <w:proofErr w:type="spellEnd"/>
+      <w:r>
+        <w:t xml:space="preserve"> speciális </w:t>
+      </w:r>
+      <w:proofErr w:type="spellStart"/>
+      <w:r>
+        <w:t>EditTeszt-ekkel</w:t>
+      </w:r>
+      <w:proofErr w:type="spellEnd"/>
+      <w:r>
+        <w:t xml:space="preserve"> végeztem el. Ezekkel a program futása nélkül tesztelhetők bizonyos funkciók. Az ehhez megírt teszteket a </w:t>
+      </w:r>
+      <w:proofErr w:type="spellStart"/>
+      <w:r>
+        <w:t>Scripts</w:t>
+      </w:r>
+      <w:proofErr w:type="spellEnd"/>
+      <w:r>
+        <w:t xml:space="preserve"> mappán belül található Editor/</w:t>
+      </w:r>
+      <w:proofErr w:type="spellStart"/>
+      <w:r>
+        <w:t>Tests</w:t>
+      </w:r>
+      <w:proofErr w:type="spellEnd"/>
+      <w:r>
+        <w:t xml:space="preserve"> almappában szereplő script tartalmazza. A program más funkcióit nehéz lett volna megoldani hasonló tesztekkel, így ismerősei</w:t>
+      </w:r>
+      <w:r>
+        <w:t>m</w:t>
+      </w:r>
+      <w:r>
+        <w:t>nek küldtem el a programot kipróbálásra.</w:t>
       </w:r>
     </w:p>
     <w:p>
@@ -2463,7 +4016,7 @@
         <w:spacing w:before="24000"/>
         <w:ind w:left="431" w:hanging="431"/>
       </w:pPr>
-      <w:bookmarkStart w:id="3" w:name="_Toc87521356"/>
+      <w:bookmarkStart w:id="3" w:name="_Toc228099599"/>
       <w:r>
         <w:lastRenderedPageBreak/>
         <w:t>Összefoglalás és tovább</w:t>
@@ -2472,18 +4025,147 @@
         <w:t>i fejlesztési lehetőségek</w:t>
       </w:r>
       <w:bookmarkEnd w:id="3"/>
+    </w:p>
+    <w:p>
+      <w:r>
+        <w:t xml:space="preserve">A program egy baráttal, vagy egyedüli időtöltésre készített játék, amely tizenöt egyjátékos és tizenöt többjátékos pályát tartalma. </w:t>
+      </w:r>
+      <w:r>
+        <w:t>Kellemes háttérzene van a program futása közben, aminek hangerejét beállításokban személyre lehet szabni. Egy pályát kiválasztva az ajtó elérése a cél, miközben ki kell kerülni a tüskéket és össze kell gyűjteni a csillagokat. Pályák teljesítése során olvashatók a történet egyes részletei.</w:t>
+      </w:r>
+    </w:p>
+    <w:p>
+      <w:r>
+        <w:t xml:space="preserve">A programot a </w:t>
+      </w:r>
+      <w:proofErr w:type="spellStart"/>
+      <w:r>
+        <w:t>Unity</w:t>
+      </w:r>
+      <w:proofErr w:type="spellEnd"/>
+      <w:r>
+        <w:t xml:space="preserve"> játékmotor és fejlesztői környezet segítségével hoztam létre, ahol C# nyelven írtam a forráskódot. A program készítés során felhasznált képek, ábrák kilencven százalékát magam készített, hogy egy egyedi világot alkossak a játéknak.</w:t>
+      </w:r>
+    </w:p>
+    <w:p>
+      <w:r>
+        <w:t>A pályák készítéséhez olyan függvényeket írtam</w:t>
+      </w:r>
+      <w:r>
+        <w:t>,</w:t>
+      </w:r>
+      <w:r>
+        <w:t xml:space="preserve"> amelyek segítettek a program futása közben betölteni a felületről a </w:t>
+      </w:r>
+      <w:proofErr w:type="spellStart"/>
+      <w:r>
+        <w:t>tilemap</w:t>
+      </w:r>
+      <w:proofErr w:type="spellEnd"/>
+      <w:r>
+        <w:t>-ek elemeit</w:t>
+      </w:r>
+      <w:r>
+        <w:t>,</w:t>
+      </w:r>
+      <w:r>
+        <w:t xml:space="preserve"> majd azokat egy saját adatszerkezetbe </w:t>
+      </w:r>
+      <w:r>
+        <w:t>betöltve</w:t>
+      </w:r>
+      <w:r>
+        <w:t xml:space="preserve"> elmenteni egy fájlba</w:t>
+      </w:r>
+      <w:r>
+        <w:t>. Ezeknek a függvényeknek segítségével akár később bővíthető a program olyan lehetőségekkel</w:t>
+      </w:r>
+      <w:r>
+        <w:t>,</w:t>
+      </w:r>
+      <w:r>
+        <w:t xml:space="preserve"> ahol saját pályákat lehet készíteni, bár ehhez további új függvények is szükségesek lennének.</w:t>
+      </w:r>
+      <w:r>
+        <w:t xml:space="preserve"> A jelenleg megírt mentésre szolgáló függvények a </w:t>
+      </w:r>
+      <w:proofErr w:type="spellStart"/>
+      <w:r>
+        <w:t>TileMapController</w:t>
+      </w:r>
+      <w:proofErr w:type="spellEnd"/>
+      <w:r>
+        <w:t xml:space="preserve"> osztályban található </w:t>
+      </w:r>
+      <w:proofErr w:type="spellStart"/>
+      <w:r>
+        <w:t>edit</w:t>
+      </w:r>
+      <w:proofErr w:type="spellEnd"/>
+      <w:r>
+        <w:t xml:space="preserve"> változó igaz értéke esetén hívhatók meg </w:t>
+      </w:r>
+      <w:proofErr w:type="spellStart"/>
+      <w:r>
+        <w:t>Ctrl</w:t>
+      </w:r>
+      <w:proofErr w:type="spellEnd"/>
+      <w:r>
+        <w:t xml:space="preserve"> + R és </w:t>
+      </w:r>
+      <w:proofErr w:type="spellStart"/>
+      <w:r>
+        <w:t>Ctrl</w:t>
+      </w:r>
+      <w:proofErr w:type="spellEnd"/>
+      <w:r>
+        <w:t xml:space="preserve"> + F gombokkal. A korábbi gombkombináció betölti a különböző </w:t>
+      </w:r>
+      <w:proofErr w:type="spellStart"/>
+      <w:r>
+        <w:t>tilemap</w:t>
+      </w:r>
+      <w:proofErr w:type="spellEnd"/>
+      <w:r>
+        <w:t xml:space="preserve"> rétegeken szereplő pályaelemek adatait az osztályokban tárolt változókba, majd a </w:t>
+      </w:r>
+      <w:proofErr w:type="spellStart"/>
+      <w:r>
+        <w:t>Ctrl</w:t>
+      </w:r>
+      <w:proofErr w:type="spellEnd"/>
+      <w:r>
+        <w:t xml:space="preserve"> + F fájlba írja azokat. Bizonyos beállításokat kézzel kell megadni a teljes működéshez ezért lett szétválasztva ez a két funkció. Ha esetleg nincs betöltve semmi, akkor a mentés előtt lefut a betöltéshez használt függvény is. </w:t>
+      </w:r>
+      <w:r>
+        <w:t xml:space="preserve">Jelenleg a pálya „rajzolás” -hoz nincs készítve függvény, ezt a funkciót a </w:t>
+      </w:r>
+      <w:proofErr w:type="spellStart"/>
+      <w:r>
+        <w:t>U</w:t>
+      </w:r>
+      <w:r>
+        <w:t>nity</w:t>
+      </w:r>
+      <w:proofErr w:type="spellEnd"/>
+      <w:r>
+        <w:t xml:space="preserve"> editor</w:t>
+      </w:r>
+      <w:r>
+        <w:t xml:space="preserve"> felületének segítségével</w:t>
+      </w:r>
+      <w:r>
+        <w:t xml:space="preserve"> végeztem el.</w:t>
+      </w:r>
     </w:p>
     <w:p/>
     <w:p>
-      <w:r>
-        <w:br w:type="page"/>
-      </w:r>
-    </w:p>
-    <w:p>
       <w:pPr>
         <w:pStyle w:val="Cmsor1"/>
+        <w:spacing w:before="24000"/>
+        <w:ind w:left="431" w:hanging="431"/>
       </w:pPr>
-      <w:bookmarkStart w:id="4" w:name="_Toc87521357"/>
+      <w:bookmarkStart w:id="4" w:name="_Toc228099600"/>
       <w:r>
         <w:lastRenderedPageBreak/>
         <w:t>Irodalomjegyzék</w:t>
@@ -2505,15 +4187,14 @@
         <w:spacing w:after="160" w:line="259" w:lineRule="auto"/>
         <w:jc w:val="left"/>
       </w:pPr>
-      <w:r>
-        <w:br w:type="page"/>
-      </w:r>
     </w:p>
     <w:p>
       <w:pPr>
         <w:pStyle w:val="Cmsor1"/>
+        <w:spacing w:before="24000"/>
+        <w:ind w:left="431" w:hanging="431"/>
       </w:pPr>
-      <w:bookmarkStart w:id="5" w:name="_Toc87521358"/>
+      <w:bookmarkStart w:id="5" w:name="_Toc228099601"/>
       <w:r>
         <w:lastRenderedPageBreak/>
         <w:t>Melléklet</w:t>
@@ -2528,9 +4209,12 @@
         </w:tabs>
       </w:pPr>
       <w:r>
+        <w:rPr>
+          <w:noProof/>
+        </w:rPr>
         <w:drawing>
-          <wp:inline distT="0" distB="0" distL="0" distR="0" wp14:anchorId="1D8FA0A0" wp14:editId="583418ED">
-            <wp:extent cx="5759450" cy="3236595"/>
+          <wp:inline distT="0" distB="0" distL="0" distR="0" wp14:anchorId="1D8FA0A0" wp14:editId="61A3B92F">
+            <wp:extent cx="5760000" cy="3236907"/>
             <wp:effectExtent l="0" t="0" r="0" b="1905"/>
             <wp:docPr id="653652335" name="Kép 1"/>
             <wp:cNvGraphicFramePr>
@@ -2544,7 +4228,7 @@
                     <pic:cNvPicPr/>
                   </pic:nvPicPr>
                   <pic:blipFill>
-                    <a:blip r:embed="rId16"/>
+                    <a:blip r:embed="rId17"/>
                     <a:stretch>
                       <a:fillRect/>
                     </a:stretch>
@@ -2552,7 +4236,7 @@
                   <pic:spPr>
                     <a:xfrm>
                       <a:off x="0" y="0"/>
-                      <a:ext cx="5759450" cy="3236595"/>
+                      <a:ext cx="5760000" cy="3236907"/>
                     </a:xfrm>
                     <a:prstGeom prst="rect">
                       <a:avLst/>
@@ -2565,31 +4249,57 @@
         </w:drawing>
       </w:r>
     </w:p>
+    <w:bookmarkStart w:id="6" w:name="_Ref228097428"/>
     <w:p>
       <w:pPr>
         <w:pStyle w:val="Kpalrs"/>
         <w:jc w:val="both"/>
       </w:pPr>
-      <w:fldSimple w:instr=" SEQ ábra \* ARABIC ">
-        <w:r>
-          <w:rPr>
-            <w:noProof/>
-          </w:rPr>
-          <w:t>4</w:t>
-        </w:r>
-      </w:fldSimple>
-      <w:r>
-        <w:t>. ábra Beállítások fűmenü</w:t>
-      </w:r>
+      <w:r>
+        <w:fldChar w:fldCharType="begin"/>
+      </w:r>
+      <w:r>
+        <w:instrText xml:space="preserve"> SEQ ábra \* ARABIC </w:instrText>
+      </w:r>
+      <w:r>
+        <w:fldChar w:fldCharType="separate"/>
+      </w:r>
+      <w:bookmarkStart w:id="7" w:name="_Ref228097438"/>
+      <w:r>
+        <w:rPr>
+          <w:noProof/>
+        </w:rPr>
+        <w:t>5</w:t>
+      </w:r>
+      <w:bookmarkEnd w:id="7"/>
+      <w:r>
+        <w:rPr>
+          <w:noProof/>
+        </w:rPr>
+        <w:fldChar w:fldCharType="end"/>
+      </w:r>
+      <w:r>
+        <w:t>. ábra Beállítások f</w:t>
+      </w:r>
+      <w:r>
+        <w:t>ő</w:t>
+      </w:r>
+      <w:r>
+        <w:t>menü</w:t>
+      </w:r>
+      <w:bookmarkEnd w:id="6"/>
     </w:p>
     <w:p>
       <w:pPr>
         <w:keepNext/>
       </w:pPr>
       <w:r>
+        <w:rPr>
+          <w:noProof/>
+        </w:rPr>
         <w:drawing>
-          <wp:inline distT="0" distB="0" distL="0" distR="0" wp14:anchorId="5F8704D7" wp14:editId="44CD925A">
-            <wp:extent cx="5759450" cy="3238500"/>
+          <wp:inline distT="0" distB="0" distL="0" distR="0" wp14:anchorId="5F8704D7" wp14:editId="71F0DD05">
+            <wp:extent cx="5760000" cy="3238809"/>
             <wp:effectExtent l="0" t="0" r="0" b="0"/>
             <wp:docPr id="1841728878" name="Kép 1"/>
             <wp:cNvGraphicFramePr>
@@ -2603,7 +4313,82 @@
                     <pic:cNvPicPr/>
                   </pic:nvPicPr>
                   <pic:blipFill>
-                    <a:blip r:embed="rId17"/>
+                    <a:blip r:embed="rId18"/>
+                    <a:stretch>
+                      <a:fillRect/>
+                    </a:stretch>
+                  </pic:blipFill>
+                  <pic:spPr>
+                    <a:xfrm>
+                      <a:off x="0" y="0"/>
+                      <a:ext cx="5760000" cy="3238809"/>
+                    </a:xfrm>
+                    <a:prstGeom prst="rect">
+                      <a:avLst/>
+                    </a:prstGeom>
+                  </pic:spPr>
+                </pic:pic>
+              </a:graphicData>
+            </a:graphic>
+          </wp:inline>
+        </w:drawing>
+      </w:r>
+    </w:p>
+    <w:bookmarkStart w:id="8" w:name="_Ref228097648"/>
+    <w:p>
+      <w:pPr>
+        <w:pStyle w:val="Kpalrs"/>
+        <w:jc w:val="both"/>
+      </w:pPr>
+      <w:r>
+        <w:fldChar w:fldCharType="begin"/>
+      </w:r>
+      <w:r>
+        <w:instrText xml:space="preserve"> SEQ ábra \* ARABIC </w:instrText>
+      </w:r>
+      <w:r>
+        <w:fldChar w:fldCharType="separate"/>
+      </w:r>
+      <w:r>
+        <w:rPr>
+          <w:noProof/>
+        </w:rPr>
+        <w:t>6</w:t>
+      </w:r>
+      <w:r>
+        <w:rPr>
+          <w:noProof/>
+        </w:rPr>
+        <w:fldChar w:fldCharType="end"/>
+      </w:r>
+      <w:r>
+        <w:t>. ábra Játék mód választó panel</w:t>
+      </w:r>
+      <w:bookmarkEnd w:id="8"/>
+    </w:p>
+    <w:p>
+      <w:pPr>
+        <w:keepNext/>
+      </w:pPr>
+      <w:r>
+        <w:lastRenderedPageBreak/>
+        <w:drawing>
+          <wp:inline distT="0" distB="0" distL="0" distR="0" wp14:anchorId="6C0A8208" wp14:editId="518C29E1">
+            <wp:extent cx="5759450" cy="3238500"/>
+            <wp:effectExtent l="0" t="0" r="0" b="0"/>
+            <wp:docPr id="87933078" name="Kép 1"/>
+            <wp:cNvGraphicFramePr>
+              <a:graphicFrameLocks xmlns:a="http://schemas.openxmlformats.org/drawingml/2006/main" noChangeAspect="1"/>
+            </wp:cNvGraphicFramePr>
+            <a:graphic xmlns:a="http://schemas.openxmlformats.org/drawingml/2006/main">
+              <a:graphicData uri="http://schemas.openxmlformats.org/drawingml/2006/picture">
+                <pic:pic xmlns:pic="http://schemas.openxmlformats.org/drawingml/2006/picture">
+                  <pic:nvPicPr>
+                    <pic:cNvPr id="87933078" name=""/>
+                    <pic:cNvPicPr/>
+                  </pic:nvPicPr>
+                  <pic:blipFill>
+                    <a:blip r:embed="rId19"/>
                     <a:stretch>
                       <a:fillRect/>
                     </a:stretch>
@@ -2624,25 +4409,109 @@
         </w:drawing>
       </w:r>
     </w:p>
+    <w:bookmarkStart w:id="9" w:name="_Ref228099537"/>
     <w:p>
       <w:pPr>
         <w:pStyle w:val="Kpalrs"/>
         <w:jc w:val="both"/>
       </w:pPr>
-      <w:fldSimple w:instr=" SEQ ábra \* ARABIC ">
-        <w:r>
-          <w:rPr>
-            <w:noProof/>
-          </w:rPr>
-          <w:t>5</w:t>
-        </w:r>
-      </w:fldSimple>
-      <w:r>
-        <w:t>. ábra Játék mód választó panel</w:t>
-      </w:r>
+      <w:r>
+        <w:fldChar w:fldCharType="begin"/>
+      </w:r>
+      <w:r>
+        <w:instrText xml:space="preserve"> SEQ ábra \* ARABIC </w:instrText>
+      </w:r>
+      <w:r>
+        <w:fldChar w:fldCharType="separate"/>
+      </w:r>
+      <w:r>
+        <w:rPr>
+          <w:noProof/>
+        </w:rPr>
+        <w:t>7</w:t>
+      </w:r>
+      <w:r>
+        <w:fldChar w:fldCharType="end"/>
+      </w:r>
+      <w:r>
+        <w:t>. ábra Többjátékos térkép</w:t>
+      </w:r>
+      <w:bookmarkEnd w:id="9"/>
     </w:p>
+    <w:p>
+      <w:pPr>
+        <w:keepNext/>
+      </w:pPr>
+      <w:r>
+        <w:drawing>
+          <wp:inline distT="0" distB="0" distL="0" distR="0" wp14:anchorId="0A024C00" wp14:editId="001609BE">
+            <wp:extent cx="5759450" cy="3238500"/>
+            <wp:effectExtent l="0" t="0" r="0" b="0"/>
+            <wp:docPr id="1592973777" name="Kép 1"/>
+            <wp:cNvGraphicFramePr>
+              <a:graphicFrameLocks xmlns:a="http://schemas.openxmlformats.org/drawingml/2006/main" noChangeAspect="1"/>
+            </wp:cNvGraphicFramePr>
+            <a:graphic xmlns:a="http://schemas.openxmlformats.org/drawingml/2006/main">
+              <a:graphicData uri="http://schemas.openxmlformats.org/drawingml/2006/picture">
+                <pic:pic xmlns:pic="http://schemas.openxmlformats.org/drawingml/2006/picture">
+                  <pic:nvPicPr>
+                    <pic:cNvPr id="1592973777" name=""/>
+                    <pic:cNvPicPr/>
+                  </pic:nvPicPr>
+                  <pic:blipFill>
+                    <a:blip r:embed="rId20"/>
+                    <a:stretch>
+                      <a:fillRect/>
+                    </a:stretch>
+                  </pic:blipFill>
+                  <pic:spPr>
+                    <a:xfrm>
+                      <a:off x="0" y="0"/>
+                      <a:ext cx="5759450" cy="3238500"/>
+                    </a:xfrm>
+                    <a:prstGeom prst="rect">
+                      <a:avLst/>
+                    </a:prstGeom>
+                  </pic:spPr>
+                </pic:pic>
+              </a:graphicData>
+            </a:graphic>
+          </wp:inline>
+        </w:drawing>
+      </w:r>
+    </w:p>
+    <w:bookmarkStart w:id="10" w:name="_Ref228099570"/>
+    <w:p>
+      <w:pPr>
+        <w:pStyle w:val="Kpalrs"/>
+        <w:jc w:val="both"/>
+      </w:pPr>
+      <w:r>
+        <w:fldChar w:fldCharType="begin"/>
+      </w:r>
+      <w:r>
+        <w:instrText xml:space="preserve"> SEQ ábra \* ARABIC </w:instrText>
+      </w:r>
+      <w:r>
+        <w:fldChar w:fldCharType="separate"/>
+      </w:r>
+      <w:r>
+        <w:rPr>
+          <w:noProof/>
+        </w:rPr>
+        <w:t>8</w:t>
+      </w:r>
+      <w:r>
+        <w:fldChar w:fldCharType="end"/>
+      </w:r>
+      <w:r>
+        <w:t>. ábra Térkép menü</w:t>
+      </w:r>
+      <w:bookmarkEnd w:id="10"/>
+    </w:p>
+    <w:p/>
     <w:sectPr>
-      <w:footerReference w:type="default" r:id="rId18"/>
+      <w:footerReference w:type="default" r:id="rId21"/>
       <w:pgSz w:w="11906" w:h="16838"/>
       <w:pgMar w:top="1418" w:right="1418" w:bottom="1418" w:left="1418" w:header="709" w:footer="709" w:gutter="0"/>
       <w:pgNumType w:start="1"/>

</xml_diff>